<commit_message>
Point contact downloads to updated agent-mode files
</commit_message>
<xml_diff>
--- a/public/cv-dan-portofolio/CV Rifqy by agent mode.docx
+++ b/public/cv-dan-portofolio/CV Rifqy by agent mode.docx
@@ -4,17 +4,17 @@
   <w:body>
     <w:bookmarkStart w:id="20" w:name="header"/>
     <w:bookmarkEnd w:id="20"/>
-    <w:bookmarkStart w:id="38" w:name="content"/>
-    <w:bookmarkStart w:id="37" w:name="X17a26862f0cec3dd420a43b5abcb0d685a140e8"/>
+    <w:bookmarkStart w:id="42" w:name="content"/>
+    <w:bookmarkStart w:id="41" w:name="X17a26862f0cec3dd420a43b5abcb0d685a140e8"/>
     <w:p>
       <w:pPr>
         <w:pStyle w:val="Heading1"/>
       </w:pPr>
       <w:r>
-        <w:t xml:space="preserve">Curriculum Vitae – Rifqy Hazim Haidar Ramadhan</w:t>
-      </w:r>
-    </w:p>
-    <w:bookmarkStart w:id="22" w:name="informasi-pribadi"/>
+        <w:t xml:space="preserve">Curriculum Vitae – Rifqy Hazim Haidar Ramadhan</w:t>
+      </w:r>
+    </w:p>
+    <w:bookmarkStart w:id="23" w:name="informasi-pribadi"/>
     <w:p>
       <w:pPr>
         <w:pStyle w:val="Heading2"/>
@@ -38,7 +38,7 @@
         <w:t xml:space="preserve"> </w:t>
       </w:r>
       <w:r>
-        <w:t xml:space="preserve">Rifqy Hazim Haidar Ramadhan</w:t>
+        <w:t xml:space="preserve">Rifqy Hazim Haidar Ramadhan</w:t>
       </w:r>
       <w:r>
         <w:br/>
@@ -54,7 +54,7 @@
         <w:t xml:space="preserve"> </w:t>
       </w:r>
       <w:r>
-        <w:t xml:space="preserve">Tangerang, 17 November 2002</w:t>
+        <w:t xml:space="preserve">Tangerang, 17 November 2002</w:t>
       </w:r>
       <w:r>
         <w:br/>
@@ -144,54 +144,6 @@
           <w:b/>
           <w:bCs/>
         </w:rPr>
-        <w:t xml:space="preserve">Kontak:</w:t>
-      </w:r>
-      <w:r>
-        <w:t xml:space="preserve"> </w:t>
-      </w:r>
-      <w:r>
-        <w:t xml:space="preserve">0813‑2296‑3566 | rifqyhazim22@gmail.com</w:t>
-      </w:r>
-      <w:r>
-        <w:br/>
-      </w:r>
-      <w:r>
-        <w:rPr>
-          <w:b/>
-          <w:bCs/>
-        </w:rPr>
-        <w:t xml:space="preserve">LinkedIn:</w:t>
-      </w:r>
-      <w:r>
-        <w:t xml:space="preserve"> </w:t>
-      </w:r>
-      <w:r>
-        <w:t xml:space="preserve">linkedin.com/in/rifqy-hazim-h-r-88963128a</w:t>
-      </w:r>
-      <w:r>
-        <w:br/>
-      </w:r>
-      <w:r>
-        <w:rPr>
-          <w:b/>
-          <w:bCs/>
-        </w:rPr>
-        <w:t xml:space="preserve">Instagram:</w:t>
-      </w:r>
-      <w:r>
-        <w:t xml:space="preserve"> </w:t>
-      </w:r>
-      <w:r>
-        <w:t xml:space="preserve">@rifqy__hazim._</w:t>
-      </w:r>
-      <w:r>
-        <w:br/>
-      </w:r>
-      <w:r>
-        <w:rPr>
-          <w:b/>
-          <w:bCs/>
-        </w:rPr>
         <w:t xml:space="preserve">Motto Hidup:</w:t>
       </w:r>
       <w:r>
@@ -208,11 +160,106 @@
         <w:t xml:space="preserve"> </w:t>
       </w:r>
       <w:r>
-        <w:t xml:space="preserve">— “Menuju Bintang &amp; Menyelami Jurang.”</w:t>
-      </w:r>
-    </w:p>
-    <w:bookmarkEnd w:id="22"/>
-    <w:bookmarkStart w:id="23" w:name="ringkasan-profil"/>
+        <w:t xml:space="preserve">– “Menuju Bintang &amp; Menyelami Jurang”</w:t>
+      </w:r>
+      <w:r>
+        <w:br/>
+      </w:r>
+      <w:r>
+        <w:rPr>
+          <w:b/>
+          <w:bCs/>
+        </w:rPr>
+        <w:t xml:space="preserve">Filosofi Pribadi:</w:t>
+      </w:r>
+      <w:r>
+        <w:t xml:space="preserve"> </w:t>
+      </w:r>
+      <w:r>
+        <w:rPr>
+          <w:b/>
+          <w:bCs/>
+        </w:rPr>
+        <w:t xml:space="preserve">Freedom of Intelligence</w:t>
+      </w:r>
+      <w:r>
+        <w:t xml:space="preserve"> </w:t>
+      </w:r>
+      <w:r>
+        <w:t xml:space="preserve">– membawa kecerdasan ke semua orang melalui teknologi empatik dan berorientasi konteks.</w:t>
+      </w:r>
+      <w:r>
+        <w:br/>
+      </w:r>
+      <w:r>
+        <w:rPr>
+          <w:b/>
+          <w:bCs/>
+        </w:rPr>
+        <w:t xml:space="preserve">Kontak:</w:t>
+      </w:r>
+      <w:r>
+        <w:t xml:space="preserve"> </w:t>
+      </w:r>
+      <w:r>
+        <w:t xml:space="preserve">0813‑2296‑3566 | rifqyhazim22@gmail.com</w:t>
+      </w:r>
+      <w:r>
+        <w:br/>
+      </w:r>
+      <w:r>
+        <w:rPr>
+          <w:b/>
+          <w:bCs/>
+        </w:rPr>
+        <w:t xml:space="preserve">Website:</w:t>
+      </w:r>
+      <w:r>
+        <w:t xml:space="preserve"> </w:t>
+      </w:r>
+      <w:hyperlink r:id="rId22">
+        <w:r>
+          <w:rPr>
+            <w:rStyle w:val="Hyperlink"/>
+          </w:rPr>
+          <w:t xml:space="preserve">rifqy‑portofolio.vercel.app</w:t>
+        </w:r>
+      </w:hyperlink>
+      <w:r>
+        <w:br/>
+      </w:r>
+      <w:r>
+        <w:rPr>
+          <w:b/>
+          <w:bCs/>
+        </w:rPr>
+        <w:t xml:space="preserve">LinkedIn:</w:t>
+      </w:r>
+      <w:r>
+        <w:t xml:space="preserve"> </w:t>
+      </w:r>
+      <w:r>
+        <w:t xml:space="preserve">linkedin.com/in/rifqy-hazim-h-r-88963128a</w:t>
+      </w:r>
+      <w:r>
+        <w:br/>
+      </w:r>
+      <w:r>
+        <w:rPr>
+          <w:b/>
+          <w:bCs/>
+        </w:rPr>
+        <w:t xml:space="preserve">Instagram:</w:t>
+      </w:r>
+      <w:r>
+        <w:t xml:space="preserve"> </w:t>
+      </w:r>
+      <w:r>
+        <w:t xml:space="preserve">@rifqy__hazim._</w:t>
+      </w:r>
+    </w:p>
+    <w:bookmarkEnd w:id="23"/>
+    <w:bookmarkStart w:id="25" w:name="ringkasan-profil"/>
     <w:p>
       <w:pPr>
         <w:pStyle w:val="Heading2"/>
@@ -226,48 +273,25 @@
         <w:pStyle w:val="FirstParagraph"/>
       </w:pPr>
       <w:r>
-        <w:t xml:space="preserve">Pribadi strategis dan analitis dengan orientasi jangka panjang dan pencapaian hasil. Berpengalaman dalam</w:t>
-      </w:r>
-      <w:r>
-        <w:t xml:space="preserve"> </w:t>
-      </w:r>
-      <w:r>
-        <w:rPr>
-          <w:b/>
-          <w:bCs/>
-        </w:rPr>
-        <w:t xml:space="preserve">sales otomotif</w:t>
-      </w:r>
-      <w:r>
-        <w:t xml:space="preserve">,</w:t>
-      </w:r>
-      <w:r>
-        <w:t xml:space="preserve"> </w:t>
-      </w:r>
-      <w:r>
-        <w:rPr>
-          <w:b/>
-          <w:bCs/>
-        </w:rPr>
-        <w:t xml:space="preserve">pemasaran digital &amp; kreatif</w:t>
-      </w:r>
-      <w:r>
-        <w:t xml:space="preserve">, dan</w:t>
-      </w:r>
-      <w:r>
-        <w:t xml:space="preserve"> </w:t>
-      </w:r>
-      <w:r>
-        <w:rPr>
-          <w:b/>
-          <w:bCs/>
-        </w:rPr>
-        <w:t xml:space="preserve">pengembangan AI generatif</w:t>
-      </w:r>
-      <w:r>
-        <w:t xml:space="preserve">. Terampil dalam komunikasi, negosiasi, pembangunan strategi penjualan, serta membangun ekosistem digital berbasis AI. Berkomitmen menjadi inovator di bidang AI, teknologi web, dan solusi pemasaran modern</w:t>
-      </w:r>
-      <w:hyperlink r:id="rId21">
+        <w:t xml:space="preserve">Profesional</w:t>
+      </w:r>
+      <w:r>
+        <w:t xml:space="preserve"> </w:t>
+      </w:r>
+      <w:r>
+        <w:rPr>
+          <w:b/>
+          <w:bCs/>
+        </w:rPr>
+        <w:t xml:space="preserve">Generative AI Engineer, Prompt/Context Engineer &amp; AI Agent Developer</w:t>
+      </w:r>
+      <w:r>
+        <w:t xml:space="preserve"> </w:t>
+      </w:r>
+      <w:r>
+        <w:t xml:space="preserve">dengan pengalaman mendalam dalam desain agen LLM, pipeline generatif, pengembangan aplikasi web dan mobile, serta eksplorasi robotika dan Web3. Terampil merancang agen LLM multi‑step dengan memori dan evaluasi, mengembangkan video &amp; gambar AI realistis (Sora, Runway, Flow, Veo), serta membangun website modern (Next.js, Astro, TypeScript). Berorientasi pada kualitas tinggi, dokumentasi rapi, dan kolaborasi transparan. Berkomitmen membangun ekosistem inovasi yang menggabungkan AI, robotika, Web3, dan pengembangan bisnis</w:t>
+      </w:r>
+      <w:hyperlink r:id="rId24">
         <w:r>
           <w:rPr>
             <w:rStyle w:val="Hyperlink"/>
@@ -279,8 +303,42 @@
         <w:t xml:space="preserve">.</w:t>
       </w:r>
     </w:p>
-    <w:bookmarkEnd w:id="23"/>
-    <w:bookmarkStart w:id="25" w:name="pendidikan"/>
+    <w:bookmarkEnd w:id="25"/>
+    <w:bookmarkStart w:id="26" w:name="tujuan-karier"/>
+    <w:p>
+      <w:pPr>
+        <w:pStyle w:val="Heading2"/>
+      </w:pPr>
+      <w:r>
+        <w:t xml:space="preserve">Tujuan Karier</w:t>
+      </w:r>
+    </w:p>
+    <w:p>
+      <w:pPr>
+        <w:pStyle w:val="FirstParagraph"/>
+      </w:pPr>
+      <w:r>
+        <w:t xml:space="preserve">Menjadi</w:t>
+      </w:r>
+      <w:r>
+        <w:t xml:space="preserve"> </w:t>
+      </w:r>
+      <w:r>
+        <w:rPr>
+          <w:b/>
+          <w:bCs/>
+        </w:rPr>
+        <w:t xml:space="preserve">Generative AI Engineer &amp; AI Agent Developer</w:t>
+      </w:r>
+      <w:r>
+        <w:t xml:space="preserve"> </w:t>
+      </w:r>
+      <w:r>
+        <w:t xml:space="preserve">yang memimpin inovasi di bidang AI, generative media, dan robotika. Fokus saya adalah merancang agen LLM yang adaptif, pipeline generatif yang efisien, serta membangun aplikasi web dan mobile yang mengintegrasikan AI secara mendalam. Saya juga berupaya memperkuat ekosistem Web3, tokenomics, dan crypto untuk mendukung ekonomi digital masa depan.</w:t>
+      </w:r>
+    </w:p>
+    <w:bookmarkEnd w:id="26"/>
+    <w:bookmarkStart w:id="28" w:name="pendidikan"/>
     <w:p>
       <w:pPr>
         <w:pStyle w:val="Heading2"/>
@@ -350,20 +408,20 @@
                 <w:b/>
                 <w:bCs/>
               </w:rPr>
-              <w:t xml:space="preserve">Universitas Islam Negeri Jakarta</w:t>
-            </w:r>
-          </w:p>
-        </w:tc>
-        <w:tc>
-          <w:tcPr/>
-          <w:p>
-            <w:pPr>
-              <w:pStyle w:val="Compact"/>
-            </w:pPr>
-            <w:r>
-              <w:t xml:space="preserve">S1 Kajian Islam; hingga semester 6, berhenti Maret 2025, IPK terakhir 3,3</w:t>
-            </w:r>
-            <w:hyperlink r:id="rId24">
+              <w:t xml:space="preserve">Universitas Islam Negeri Syarif Hidayatullah Jakarta</w:t>
+            </w:r>
+          </w:p>
+        </w:tc>
+        <w:tc>
+          <w:tcPr/>
+          <w:p>
+            <w:pPr>
+              <w:pStyle w:val="Compact"/>
+            </w:pPr>
+            <w:r>
+              <w:t xml:space="preserve">S1 Studi Agama; berhenti pada semester 6 (IPK 3,3)</w:t>
+            </w:r>
+            <w:hyperlink r:id="rId27">
               <w:r>
                 <w:rPr>
                   <w:rStyle w:val="Hyperlink"/>
@@ -371,19 +429,16 @@
                 <w:t xml:space="preserve">[3]</w:t>
               </w:r>
             </w:hyperlink>
-            <w:r>
-              <w:t xml:space="preserve">.</w:t>
-            </w:r>
-          </w:p>
-        </w:tc>
-        <w:tc>
-          <w:tcPr/>
-          <w:p>
-            <w:pPr>
-              <w:pStyle w:val="Compact"/>
-            </w:pPr>
-            <w:r>
-              <w:t xml:space="preserve">2022–2025</w:t>
+          </w:p>
+        </w:tc>
+        <w:tc>
+          <w:tcPr/>
+          <w:p>
+            <w:pPr>
+              <w:pStyle w:val="Compact"/>
+            </w:pPr>
+            <w:r>
+              <w:t xml:space="preserve">2022 – 2025</w:t>
             </w:r>
           </w:p>
         </w:tc>
@@ -400,29 +455,37 @@
                 <w:b/>
                 <w:bCs/>
               </w:rPr>
-              <w:t xml:space="preserve">MA Husnul Khotimah Boarding School</w:t>
-            </w:r>
-          </w:p>
-        </w:tc>
-        <w:tc>
-          <w:tcPr/>
-          <w:p>
-            <w:pPr>
-              <w:pStyle w:val="Compact"/>
-            </w:pPr>
-            <w:r>
-              <w:t xml:space="preserve">Lulus 2021, Predikat Sangat Baik (Hafalan 30 Juz)</w:t>
-            </w:r>
-          </w:p>
-        </w:tc>
-        <w:tc>
-          <w:tcPr/>
-          <w:p>
-            <w:pPr>
-              <w:pStyle w:val="Compact"/>
-            </w:pPr>
-            <w:r>
-              <w:t xml:space="preserve">2018–2021</w:t>
+              <w:t xml:space="preserve">MA Husnul Khotimah Boarding School</w:t>
+            </w:r>
+          </w:p>
+        </w:tc>
+        <w:tc>
+          <w:tcPr/>
+          <w:p>
+            <w:pPr>
+              <w:pStyle w:val="Compact"/>
+            </w:pPr>
+            <w:r>
+              <w:t xml:space="preserve">Lulus 2021 dengan hafalan 30 juz dan prestasi akademik sangat baik</w:t>
+            </w:r>
+            <w:hyperlink r:id="rId27">
+              <w:r>
+                <w:rPr>
+                  <w:rStyle w:val="Hyperlink"/>
+                </w:rPr>
+                <w:t xml:space="preserve">[3]</w:t>
+              </w:r>
+            </w:hyperlink>
+          </w:p>
+        </w:tc>
+        <w:tc>
+          <w:tcPr/>
+          <w:p>
+            <w:pPr>
+              <w:pStyle w:val="Compact"/>
+            </w:pPr>
+            <w:r>
+              <w:t xml:space="preserve">2018 – 2021</w:t>
             </w:r>
           </w:p>
         </w:tc>
@@ -450,9 +513,9 @@
               <w:pStyle w:val="Compact"/>
             </w:pPr>
             <w:r>
-              <w:t xml:space="preserve">SDIT Tunas Harapan Ilahi, MTs Husnul Khotimah, STQ BQ Daarut Tauhid, YKTN Cibulan (Paket B &amp; C)</w:t>
-            </w:r>
-            <w:hyperlink r:id="rId24">
+              <w:t xml:space="preserve">SDIT Tunas Harapan Ilahi, MTs Husnul Khotimah, STQ BQ Daarut Tauhid, YKTN Cibulan (Paket B &amp; C)</w:t>
+            </w:r>
+            <w:hyperlink r:id="rId27">
               <w:r>
                 <w:rPr>
                   <w:rStyle w:val="Hyperlink"/>
@@ -460,26 +523,23 @@
                 <w:t xml:space="preserve">[4]</w:t>
               </w:r>
             </w:hyperlink>
-            <w:r>
-              <w:t xml:space="preserve">.</w:t>
-            </w:r>
-          </w:p>
-        </w:tc>
-        <w:tc>
-          <w:tcPr/>
-          <w:p>
-            <w:pPr>
-              <w:pStyle w:val="Compact"/>
-            </w:pPr>
-            <w:r>
-              <w:t xml:space="preserve">2008–2018</w:t>
+          </w:p>
+        </w:tc>
+        <w:tc>
+          <w:tcPr/>
+          <w:p>
+            <w:pPr>
+              <w:pStyle w:val="Compact"/>
+            </w:pPr>
+            <w:r>
+              <w:t xml:space="preserve">2008 – 2018</w:t>
             </w:r>
           </w:p>
         </w:tc>
       </w:tr>
     </w:tbl>
-    <w:bookmarkEnd w:id="25"/>
-    <w:bookmarkStart w:id="27" w:name="pengalaman-kerja"/>
+    <w:bookmarkEnd w:id="28"/>
+    <w:bookmarkStart w:id="31" w:name="pengalaman-kerja"/>
     <w:p>
       <w:pPr>
         <w:pStyle w:val="Heading2"/>
@@ -561,42 +621,46 @@
                 <w:b/>
                 <w:bCs/>
               </w:rPr>
-              <w:t xml:space="preserve">AI Creative Specialist &amp; Prompt/Context Engineer</w:t>
-            </w:r>
-          </w:p>
-        </w:tc>
-        <w:tc>
-          <w:tcPr/>
-          <w:p>
-            <w:pPr>
-              <w:pStyle w:val="Compact"/>
-            </w:pPr>
-            <w:r>
-              <w:t xml:space="preserve">The Social Linked (TSL)</w:t>
-            </w:r>
-          </w:p>
-        </w:tc>
-        <w:tc>
-          <w:tcPr/>
-          <w:p>
-            <w:pPr>
-              <w:pStyle w:val="Compact"/>
-            </w:pPr>
-            <w:r>
-              <w:t xml:space="preserve">2025 – Sekarang</w:t>
-            </w:r>
-          </w:p>
-        </w:tc>
-        <w:tc>
-          <w:tcPr/>
-          <w:p>
-            <w:pPr>
-              <w:pStyle w:val="Compact"/>
-            </w:pPr>
-            <w:r>
-              <w:t xml:space="preserve">Mengembangkan DVC berbasis AI untuk brand nasional, merancang pipeline AI (Sora → Runway → Flow), serta menyusun SOP produksi. Meningkatkan efisiensi produksi video hingga 60 % dan engagement kampanye</w:t>
-            </w:r>
-            <w:hyperlink r:id="rId26">
+              <w:t xml:space="preserve">Generative AI Engineer &amp; Prompt/Context Engineer</w:t>
+            </w:r>
+          </w:p>
+        </w:tc>
+        <w:tc>
+          <w:tcPr/>
+          <w:p>
+            <w:pPr>
+              <w:pStyle w:val="Compact"/>
+            </w:pPr>
+            <w:r>
+              <w:rPr>
+                <w:b/>
+                <w:bCs/>
+              </w:rPr>
+              <w:t xml:space="preserve">The Social Linked (TSL)</w:t>
+            </w:r>
+          </w:p>
+        </w:tc>
+        <w:tc>
+          <w:tcPr/>
+          <w:p>
+            <w:pPr>
+              <w:pStyle w:val="Compact"/>
+            </w:pPr>
+            <w:r>
+              <w:t xml:space="preserve">2025 – sekarang</w:t>
+            </w:r>
+          </w:p>
+        </w:tc>
+        <w:tc>
+          <w:tcPr/>
+          <w:p>
+            <w:pPr>
+              <w:pStyle w:val="Compact"/>
+            </w:pPr>
+            <w:r>
+              <w:t xml:space="preserve">Mempelopori implementasi AI generatif di agensi marketing; merancang pipeline generatif (Sora → Runway → Flow), membangun sistem kerja baru berbasis AI, dan memimpin kampanye digital video. Upaya ini meningkatkan efisiensi produksi video hingga 60 % dan engagement kampanye</w:t>
+            </w:r>
+            <w:hyperlink r:id="rId29">
               <w:r>
                 <w:rPr>
                   <w:rStyle w:val="Hyperlink"/>
@@ -622,42 +686,46 @@
                 <w:b/>
                 <w:bCs/>
               </w:rPr>
-              <w:t xml:space="preserve">Sales Consultant</w:t>
-            </w:r>
-          </w:p>
-        </w:tc>
-        <w:tc>
-          <w:tcPr/>
-          <w:p>
-            <w:pPr>
-              <w:pStyle w:val="Compact"/>
-            </w:pPr>
-            <w:r>
-              <w:t xml:space="preserve">Mitsubishi Motors (Lautan Berlian)</w:t>
-            </w:r>
-          </w:p>
-        </w:tc>
-        <w:tc>
-          <w:tcPr/>
-          <w:p>
-            <w:pPr>
-              <w:pStyle w:val="Compact"/>
-            </w:pPr>
-            <w:r>
-              <w:t xml:space="preserve">2024 – 2025</w:t>
-            </w:r>
-          </w:p>
-        </w:tc>
-        <w:tc>
-          <w:tcPr/>
-          <w:p>
-            <w:pPr>
-              <w:pStyle w:val="Compact"/>
-            </w:pPr>
-            <w:r>
-              <w:t xml:space="preserve">Menjual produk otomotif (Xpander, Pajero, XForce, Fuso) dengan pendekatan analisis kebutuhan pelanggan. Membangun relasi jangka panjang dan memperluas jaringan prospek</w:t>
-            </w:r>
-            <w:hyperlink r:id="rId26">
+              <w:t xml:space="preserve">AI Agent Lab</w:t>
+            </w:r>
+          </w:p>
+        </w:tc>
+        <w:tc>
+          <w:tcPr/>
+          <w:p>
+            <w:pPr>
+              <w:pStyle w:val="Compact"/>
+            </w:pPr>
+            <w:r>
+              <w:rPr>
+                <w:b/>
+                <w:bCs/>
+              </w:rPr>
+              <w:t xml:space="preserve">Inisiatif Independen</w:t>
+            </w:r>
+          </w:p>
+        </w:tc>
+        <w:tc>
+          <w:tcPr/>
+          <w:p>
+            <w:pPr>
+              <w:pStyle w:val="Compact"/>
+            </w:pPr>
+            <w:r>
+              <w:t xml:space="preserve">2025 – sekarang</w:t>
+            </w:r>
+          </w:p>
+        </w:tc>
+        <w:tc>
+          <w:tcPr/>
+          <w:p>
+            <w:pPr>
+              <w:pStyle w:val="Compact"/>
+            </w:pPr>
+            <w:r>
+              <w:t xml:space="preserve">Meneliti integrasi GPT‑5 Codex dan ChatGPT untuk agen penjelajah konten dan pencari informasi; mendokumentasikan proses dan merancang modul pembelajaran AI. Hasilnya, AI agent di website pribadi dapat menjawab pertanyaan secara kontekstual</w:t>
+            </w:r>
+            <w:hyperlink r:id="rId24">
               <w:r>
                 <w:rPr>
                   <w:rStyle w:val="Hyperlink"/>
@@ -683,42 +751,46 @@
                 <w:b/>
                 <w:bCs/>
               </w:rPr>
-              <w:t xml:space="preserve">Sales Executive / Vice Director / Marketing Executive</w:t>
-            </w:r>
-          </w:p>
-        </w:tc>
-        <w:tc>
-          <w:tcPr/>
-          <w:p>
-            <w:pPr>
-              <w:pStyle w:val="Compact"/>
-            </w:pPr>
-            <w:r>
-              <w:t xml:space="preserve">PT Tiga Pilar Utama Karya Sentosa &amp; PT Tiga Pilar UKS</w:t>
-            </w:r>
-          </w:p>
-        </w:tc>
-        <w:tc>
-          <w:tcPr/>
-          <w:p>
-            <w:pPr>
-              <w:pStyle w:val="Compact"/>
-            </w:pPr>
-            <w:r>
-              <w:t xml:space="preserve">2024 – 2025</w:t>
-            </w:r>
-          </w:p>
-        </w:tc>
-        <w:tc>
-          <w:tcPr/>
-          <w:p>
-            <w:pPr>
-              <w:pStyle w:val="Compact"/>
-            </w:pPr>
-            <w:r>
-              <w:t xml:space="preserve">Mengembangkan strategi pemasaran untuk material konstruksi &amp; geotekstil, mengeksekusi perencanaan bisnis, dan memimpin proyek pengembangan bisnis baru</w:t>
-            </w:r>
-            <w:hyperlink r:id="rId26">
+              <w:t xml:space="preserve">Sales Consultant</w:t>
+            </w:r>
+          </w:p>
+        </w:tc>
+        <w:tc>
+          <w:tcPr/>
+          <w:p>
+            <w:pPr>
+              <w:pStyle w:val="Compact"/>
+            </w:pPr>
+            <w:r>
+              <w:rPr>
+                <w:b/>
+                <w:bCs/>
+              </w:rPr>
+              <w:t xml:space="preserve">Mitsubishi Motors – PT Lautan Berlian</w:t>
+            </w:r>
+          </w:p>
+        </w:tc>
+        <w:tc>
+          <w:tcPr/>
+          <w:p>
+            <w:pPr>
+              <w:pStyle w:val="Compact"/>
+            </w:pPr>
+            <w:r>
+              <w:t xml:space="preserve">2024 – 2025</w:t>
+            </w:r>
+          </w:p>
+        </w:tc>
+        <w:tc>
+          <w:tcPr/>
+          <w:p>
+            <w:pPr>
+              <w:pStyle w:val="Compact"/>
+            </w:pPr>
+            <w:r>
+              <w:t xml:space="preserve">Menjual produk otomotif (Xpander, Pajero, XForce, Fuso) dengan pendekatan value creation; menggunakan LLM untuk menyusun skrip pitching, automasi follow‑up, dan analitik CRM; membangun relasi jangka panjang</w:t>
+            </w:r>
+            <w:hyperlink r:id="rId29">
               <w:r>
                 <w:rPr>
                   <w:rStyle w:val="Hyperlink"/>
@@ -744,47 +816,51 @@
                 <w:b/>
                 <w:bCs/>
               </w:rPr>
-              <w:t xml:space="preserve">Intern Business Owner</w:t>
-            </w:r>
-          </w:p>
-        </w:tc>
-        <w:tc>
-          <w:tcPr/>
-          <w:p>
-            <w:pPr>
-              <w:pStyle w:val="Compact"/>
-            </w:pPr>
-            <w:r>
-              <w:t xml:space="preserve">Gem’s Food</w:t>
-            </w:r>
-          </w:p>
-        </w:tc>
-        <w:tc>
-          <w:tcPr/>
-          <w:p>
-            <w:pPr>
-              <w:pStyle w:val="Compact"/>
-            </w:pPr>
-            <w:r>
-              <w:t xml:space="preserve">2024</w:t>
-            </w:r>
-          </w:p>
-        </w:tc>
-        <w:tc>
-          <w:tcPr/>
-          <w:p>
-            <w:pPr>
-              <w:pStyle w:val="Compact"/>
-            </w:pPr>
-            <w:r>
-              <w:t xml:space="preserve">Merintis bisnis kuliner; melakukan riset pasar dan perencanaan bisnis, serta memanfaatkan AI untuk efisiensi operasional</w:t>
-            </w:r>
-            <w:hyperlink r:id="rId26">
+              <w:t xml:space="preserve">Strategi &amp; Networking / Vice Director / Marketing Executive</w:t>
+            </w:r>
+          </w:p>
+        </w:tc>
+        <w:tc>
+          <w:tcPr/>
+          <w:p>
+            <w:pPr>
+              <w:pStyle w:val="Compact"/>
+            </w:pPr>
+            <w:r>
+              <w:rPr>
+                <w:b/>
+                <w:bCs/>
+              </w:rPr>
+              <w:t xml:space="preserve">PT Tiga Pilar Utama Karya Sentosa &amp; UKS</w:t>
+            </w:r>
+          </w:p>
+        </w:tc>
+        <w:tc>
+          <w:tcPr/>
+          <w:p>
+            <w:pPr>
+              <w:pStyle w:val="Compact"/>
+            </w:pPr>
+            <w:r>
+              <w:t xml:space="preserve">2024 – 2025</w:t>
+            </w:r>
+          </w:p>
+        </w:tc>
+        <w:tc>
+          <w:tcPr/>
+          <w:p>
+            <w:pPr>
+              <w:pStyle w:val="Compact"/>
+            </w:pPr>
+            <w:r>
+              <w:t xml:space="preserve">Mengembangkan strategi pemasaran geotekstil &amp; konstruksi; membuat dashboard pasar berbasis AI; memimpin tim marketing; memperluas jaringan bisnis dan menangani proyek B2B</w:t>
+            </w:r>
+            <w:hyperlink r:id="rId29">
               <w:r>
                 <w:rPr>
                   <w:rStyle w:val="Hyperlink"/>
                 </w:rPr>
-                <w:t xml:space="preserve">[6]</w:t>
+                <w:t xml:space="preserve">[8]</w:t>
               </w:r>
             </w:hyperlink>
             <w:r>
@@ -805,47 +881,51 @@
                 <w:b/>
                 <w:bCs/>
               </w:rPr>
-              <w:t xml:space="preserve">Driver Online (Gojek/Grab)</w:t>
-            </w:r>
-          </w:p>
-        </w:tc>
-        <w:tc>
-          <w:tcPr/>
-          <w:p>
-            <w:pPr>
-              <w:pStyle w:val="Compact"/>
-            </w:pPr>
-            <w:r>
-              <w:t xml:space="preserve">Self‑employed</w:t>
-            </w:r>
-          </w:p>
-        </w:tc>
-        <w:tc>
-          <w:tcPr/>
-          <w:p>
-            <w:pPr>
-              <w:pStyle w:val="Compact"/>
-            </w:pPr>
-            <w:r>
-              <w:t xml:space="preserve">2025</w:t>
-            </w:r>
-          </w:p>
-        </w:tc>
-        <w:tc>
-          <w:tcPr/>
-          <w:p>
-            <w:pPr>
-              <w:pStyle w:val="Compact"/>
-            </w:pPr>
-            <w:r>
-              <w:t xml:space="preserve">Mengumpulkan data permintaan dan menganalisis pola perilaku pengguna; merencanakan layanan transportasi modern</w:t>
-            </w:r>
-            <w:hyperlink r:id="rId26">
+              <w:t xml:space="preserve">Business Owner</w:t>
+            </w:r>
+          </w:p>
+        </w:tc>
+        <w:tc>
+          <w:tcPr/>
+          <w:p>
+            <w:pPr>
+              <w:pStyle w:val="Compact"/>
+            </w:pPr>
+            <w:r>
+              <w:rPr>
+                <w:b/>
+                <w:bCs/>
+              </w:rPr>
+              <w:t xml:space="preserve">Gem’s Food</w:t>
+            </w:r>
+          </w:p>
+        </w:tc>
+        <w:tc>
+          <w:tcPr/>
+          <w:p>
+            <w:pPr>
+              <w:pStyle w:val="Compact"/>
+            </w:pPr>
+            <w:r>
+              <w:t xml:space="preserve">2024</w:t>
+            </w:r>
+          </w:p>
+        </w:tc>
+        <w:tc>
+          <w:tcPr/>
+          <w:p>
+            <w:pPr>
+              <w:pStyle w:val="Compact"/>
+            </w:pPr>
+            <w:r>
+              <w:t xml:space="preserve">Merintis bisnis kuliner; memanfaatkan riset AI untuk mengembangkan produk dan strategi go‑to‑market; meningkatkan efisiensi operasional</w:t>
+            </w:r>
+            <w:hyperlink r:id="rId29">
               <w:r>
                 <w:rPr>
                   <w:rStyle w:val="Hyperlink"/>
                 </w:rPr>
-                <w:t xml:space="preserve">[6]</w:t>
+                <w:t xml:space="preserve">[7]</w:t>
               </w:r>
             </w:hyperlink>
             <w:r>
@@ -866,47 +946,51 @@
                 <w:b/>
                 <w:bCs/>
               </w:rPr>
-              <w:t xml:space="preserve">Teacher</w:t>
-            </w:r>
-          </w:p>
-        </w:tc>
-        <w:tc>
-          <w:tcPr/>
-          <w:p>
-            <w:pPr>
-              <w:pStyle w:val="Compact"/>
-            </w:pPr>
-            <w:r>
-              <w:t xml:space="preserve">Tpq Antarkisa</w:t>
-            </w:r>
-          </w:p>
-        </w:tc>
-        <w:tc>
-          <w:tcPr/>
-          <w:p>
-            <w:pPr>
-              <w:pStyle w:val="Compact"/>
-            </w:pPr>
-            <w:r>
-              <w:t xml:space="preserve">2018</w:t>
-            </w:r>
-          </w:p>
-        </w:tc>
-        <w:tc>
-          <w:tcPr/>
-          <w:p>
-            <w:pPr>
-              <w:pStyle w:val="Compact"/>
-            </w:pPr>
-            <w:r>
-              <w:t xml:space="preserve">Mengajar dan membina siswa, termasuk pelatihan seni</w:t>
-            </w:r>
-            <w:hyperlink r:id="rId26">
+              <w:t xml:space="preserve">Driver Online / Peneliti Data</w:t>
+            </w:r>
+          </w:p>
+        </w:tc>
+        <w:tc>
+          <w:tcPr/>
+          <w:p>
+            <w:pPr>
+              <w:pStyle w:val="Compact"/>
+            </w:pPr>
+            <w:r>
+              <w:rPr>
+                <w:b/>
+                <w:bCs/>
+              </w:rPr>
+              <w:t xml:space="preserve">Grab &amp; Gojek (Self‑Employed)</w:t>
+            </w:r>
+          </w:p>
+        </w:tc>
+        <w:tc>
+          <w:tcPr/>
+          <w:p>
+            <w:pPr>
+              <w:pStyle w:val="Compact"/>
+            </w:pPr>
+            <w:r>
+              <w:t xml:space="preserve">2025</w:t>
+            </w:r>
+          </w:p>
+        </w:tc>
+        <w:tc>
+          <w:tcPr/>
+          <w:p>
+            <w:pPr>
+              <w:pStyle w:val="Compact"/>
+            </w:pPr>
+            <w:r>
+              <w:t xml:space="preserve">Mengumpulkan dan menganalisis data permintaan rideshare untuk memahami kebutuhan pelanggan; menggunakan AI untuk menghasilkan insight yang membantu meningkatkan kualitas layanan dan personalisasi interaksi dengan penumpang</w:t>
+            </w:r>
+            <w:hyperlink r:id="rId29">
               <w:r>
                 <w:rPr>
                   <w:rStyle w:val="Hyperlink"/>
                 </w:rPr>
-                <w:t xml:space="preserve">[6]</w:t>
+                <w:t xml:space="preserve">[7]</w:t>
               </w:r>
             </w:hyperlink>
             <w:r>
@@ -927,53 +1011,133 @@
                 <w:b/>
                 <w:bCs/>
               </w:rPr>
-              <w:t xml:space="preserve">Humas &amp; Event Organizer</w:t>
-            </w:r>
-          </w:p>
-        </w:tc>
-        <w:tc>
-          <w:tcPr/>
-          <w:p>
-            <w:pPr>
-              <w:pStyle w:val="Compact"/>
-            </w:pPr>
-            <w:r>
-              <w:t xml:space="preserve">Organisasi Mahasiswa &amp; Sosial</w:t>
-            </w:r>
-          </w:p>
-        </w:tc>
-        <w:tc>
-          <w:tcPr/>
-          <w:p>
-            <w:pPr>
-              <w:pStyle w:val="Compact"/>
-            </w:pPr>
-            <w:r>
-              <w:t xml:space="preserve">2019–2023</w:t>
-            </w:r>
-          </w:p>
-        </w:tc>
-        <w:tc>
-          <w:tcPr/>
-          <w:p>
-            <w:pPr>
-              <w:pStyle w:val="Compact"/>
-            </w:pPr>
-            <w:r>
-              <w:t xml:space="preserve">Menyelenggarakan konferensi dan acara regional/nasional; mengatur komunikasi publik dan logistik acara.</w:t>
+              <w:t xml:space="preserve">Teacher &amp; Educator</w:t>
+            </w:r>
+          </w:p>
+        </w:tc>
+        <w:tc>
+          <w:tcPr/>
+          <w:p>
+            <w:pPr>
+              <w:pStyle w:val="Compact"/>
+            </w:pPr>
+            <w:r>
+              <w:rPr>
+                <w:b/>
+                <w:bCs/>
+              </w:rPr>
+              <w:t xml:space="preserve">Tpq Antarkisa</w:t>
+            </w:r>
+          </w:p>
+        </w:tc>
+        <w:tc>
+          <w:tcPr/>
+          <w:p>
+            <w:pPr>
+              <w:pStyle w:val="Compact"/>
+            </w:pPr>
+            <w:r>
+              <w:t xml:space="preserve">2018</w:t>
+            </w:r>
+          </w:p>
+        </w:tc>
+        <w:tc>
+          <w:tcPr/>
+          <w:p>
+            <w:pPr>
+              <w:pStyle w:val="Compact"/>
+            </w:pPr>
+            <w:r>
+              <w:t xml:space="preserve">Mengajar dan melatih seni baca Al‑Qur’an; mengembangkan kurikulum yang mendukung pengembangan karakter siswa</w:t>
+            </w:r>
+            <w:hyperlink r:id="rId29">
+              <w:r>
+                <w:rPr>
+                  <w:rStyle w:val="Hyperlink"/>
+                </w:rPr>
+                <w:t xml:space="preserve">[7]</w:t>
+              </w:r>
+            </w:hyperlink>
+            <w:r>
+              <w:t xml:space="preserve">.</w:t>
+            </w:r>
+          </w:p>
+        </w:tc>
+      </w:tr>
+      <w:tr>
+        <w:tc>
+          <w:tcPr/>
+          <w:p>
+            <w:pPr>
+              <w:pStyle w:val="Compact"/>
+            </w:pPr>
+            <w:r>
+              <w:rPr>
+                <w:b/>
+                <w:bCs/>
+              </w:rPr>
+              <w:t xml:space="preserve">Event Organizer &amp; Public Relations</w:t>
+            </w:r>
+          </w:p>
+        </w:tc>
+        <w:tc>
+          <w:tcPr/>
+          <w:p>
+            <w:pPr>
+              <w:pStyle w:val="Compact"/>
+            </w:pPr>
+            <w:r>
+              <w:rPr>
+                <w:b/>
+                <w:bCs/>
+              </w:rPr>
+              <w:t xml:space="preserve">Berbagai Organisasi Mahasiswa</w:t>
+            </w:r>
+          </w:p>
+        </w:tc>
+        <w:tc>
+          <w:tcPr/>
+          <w:p>
+            <w:pPr>
+              <w:pStyle w:val="Compact"/>
+            </w:pPr>
+            <w:r>
+              <w:t xml:space="preserve">2019 – 2023</w:t>
+            </w:r>
+          </w:p>
+        </w:tc>
+        <w:tc>
+          <w:tcPr/>
+          <w:p>
+            <w:pPr>
+              <w:pStyle w:val="Compact"/>
+            </w:pPr>
+            <w:r>
+              <w:t xml:space="preserve">Menyelenggarakan konferensi dan acara nasional; mengurus komunikasi publik, media relations, logistik, dan koordinasi relawan</w:t>
+            </w:r>
+            <w:hyperlink r:id="rId30">
+              <w:r>
+                <w:rPr>
+                  <w:rStyle w:val="Hyperlink"/>
+                </w:rPr>
+                <w:t xml:space="preserve">[9]</w:t>
+              </w:r>
+            </w:hyperlink>
+            <w:r>
+              <w:t xml:space="preserve">.</w:t>
             </w:r>
           </w:p>
         </w:tc>
       </w:tr>
     </w:tbl>
-    <w:bookmarkEnd w:id="27"/>
-    <w:bookmarkStart w:id="28" w:name="proyek-inisiatif-penting"/>
+    <w:bookmarkEnd w:id="31"/>
+    <w:bookmarkStart w:id="34" w:name="proyek-dan-portofolio-penting"/>
     <w:p>
       <w:pPr>
         <w:pStyle w:val="Heading2"/>
       </w:pPr>
       <w:r>
-        <w:t xml:space="preserve">Proyek &amp; Inisiatif Penting</w:t>
+        <w:t xml:space="preserve">Proyek dan Portofolio Penting</w:t>
       </w:r>
     </w:p>
     <w:p>
@@ -989,13 +1153,72 @@
           <w:b/>
           <w:bCs/>
         </w:rPr>
-        <w:t xml:space="preserve">Landing Page TSL</w:t>
-      </w:r>
-      <w:r>
-        <w:t xml:space="preserve"> </w:t>
-      </w:r>
-      <w:r>
-        <w:t xml:space="preserve">– Mendesain ulang halaman utama TSL sebagai single‑page application dengan router, toggle tema, switch bahasa, navigasi aksesibel, backend Node.js, dan build otomatis.</w:t>
+        <w:t xml:space="preserve">Web Portofolio AI Interaktif</w:t>
+      </w:r>
+      <w:r>
+        <w:t xml:space="preserve"> </w:t>
+      </w:r>
+      <w:r>
+        <w:t xml:space="preserve">– Situs personal</w:t>
+      </w:r>
+      <w:r>
+        <w:t xml:space="preserve"> </w:t>
+      </w:r>
+      <w:hyperlink r:id="rId22">
+        <w:r>
+          <w:rPr>
+            <w:rStyle w:val="Hyperlink"/>
+          </w:rPr>
+          <w:t xml:space="preserve">rifqy‑portofolio.vercel.app</w:t>
+        </w:r>
+      </w:hyperlink>
+      <w:r>
+        <w:t xml:space="preserve"> </w:t>
+      </w:r>
+      <w:r>
+        <w:t xml:space="preserve">yang dibangun dengan</w:t>
+      </w:r>
+      <w:r>
+        <w:t xml:space="preserve"> </w:t>
+      </w:r>
+      <w:r>
+        <w:rPr>
+          <w:b/>
+          <w:bCs/>
+        </w:rPr>
+        <w:t xml:space="preserve">Next.js</w:t>
+      </w:r>
+      <w:r>
+        <w:t xml:space="preserve">, dideploy di</w:t>
+      </w:r>
+      <w:r>
+        <w:t xml:space="preserve"> </w:t>
+      </w:r>
+      <w:r>
+        <w:rPr>
+          <w:b/>
+          <w:bCs/>
+        </w:rPr>
+        <w:t xml:space="preserve">Vercel</w:t>
+      </w:r>
+      <w:r>
+        <w:t xml:space="preserve">, dan menggunakan</w:t>
+      </w:r>
+      <w:r>
+        <w:t xml:space="preserve"> </w:t>
+      </w:r>
+      <w:r>
+        <w:rPr>
+          <w:b/>
+          <w:bCs/>
+        </w:rPr>
+        <w:t xml:space="preserve">GitHub</w:t>
+      </w:r>
+      <w:r>
+        <w:t xml:space="preserve"> </w:t>
+      </w:r>
+      <w:r>
+        <w:t xml:space="preserve">untuk version control. Situs ini bilingual dan terintegrasi AI agent untuk menjawab pertanyaan pengunjung.</w:t>
       </w:r>
     </w:p>
     <w:p>
@@ -1011,13 +1234,13 @@
           <w:b/>
           <w:bCs/>
         </w:rPr>
-        <w:t xml:space="preserve">Migrasi Portofolio Next.js</w:t>
-      </w:r>
-      <w:r>
-        <w:t xml:space="preserve"> </w:t>
-      </w:r>
-      <w:r>
-        <w:t xml:space="preserve">– Memimpin migrasi portofolio ke Next.js 15 App Router dengan sistem konten bilingual, UI interaktif, AI chat agent, dan dokumentasi deploy.</w:t>
+        <w:t xml:space="preserve">Migrasi Portofolio ke Next.js</w:t>
+      </w:r>
+      <w:r>
+        <w:t xml:space="preserve"> </w:t>
+      </w:r>
+      <w:r>
+        <w:t xml:space="preserve">– Membangun sistem konten bilingual dengan loader ber‑cache, AI chat agent berbasis heuristik navigasi, dan dokumentasi deploy lengkap.</w:t>
       </w:r>
     </w:p>
     <w:p>
@@ -1033,13 +1256,24 @@
           <w:b/>
           <w:bCs/>
         </w:rPr>
-        <w:t xml:space="preserve">Digital Video Commercial (DVC) AI</w:t>
-      </w:r>
-      <w:r>
-        <w:t xml:space="preserve"> </w:t>
-      </w:r>
-      <w:r>
-        <w:t xml:space="preserve">– Mengembangkan DVC 24 detik untuk Goldi Skincare; menyusun SOP produksi dan storytelling visual-audio sesuai tren Gen Z.</w:t>
+        <w:t xml:space="preserve">LLM Concierge Lab</w:t>
+      </w:r>
+      <w:r>
+        <w:t xml:space="preserve"> </w:t>
+      </w:r>
+      <w:r>
+        <w:t xml:space="preserve">– Pembuatan agen GPT‑5 Codex untuk penjelajahan konten, memori, dan evaluasi otomatis; digunakan dalam AI agent portofolio</w:t>
+      </w:r>
+      <w:hyperlink r:id="rId32">
+        <w:r>
+          <w:rPr>
+            <w:rStyle w:val="Hyperlink"/>
+          </w:rPr>
+          <w:t xml:space="preserve">[10]</w:t>
+        </w:r>
+      </w:hyperlink>
+      <w:r>
+        <w:t xml:space="preserve">.</w:t>
       </w:r>
     </w:p>
     <w:p>
@@ -1055,13 +1289,24 @@
           <w:b/>
           <w:bCs/>
         </w:rPr>
-        <w:t xml:space="preserve">Influencer Marketing AI</w:t>
-      </w:r>
-      <w:r>
-        <w:t xml:space="preserve"> </w:t>
-      </w:r>
-      <w:r>
-        <w:t xml:space="preserve">– Menghasilkan iklan 56 detik untuk layanan KOL management; menjamin konsistensi visual dan mempercepat produksi.</w:t>
+        <w:t xml:space="preserve">Pipeline DVC “Goldi”</w:t>
+      </w:r>
+      <w:r>
+        <w:t xml:space="preserve"> </w:t>
+      </w:r>
+      <w:r>
+        <w:t xml:space="preserve">– Mengembangkan pipeline generatif video ultra‑realistis 24 detik; menyusun SOP dari storyboard hingga audio lip‑sync</w:t>
+      </w:r>
+      <w:hyperlink r:id="rId32">
+        <w:r>
+          <w:rPr>
+            <w:rStyle w:val="Hyperlink"/>
+          </w:rPr>
+          <w:t xml:space="preserve">[10]</w:t>
+        </w:r>
+      </w:hyperlink>
+      <w:r>
+        <w:t xml:space="preserve">.</w:t>
       </w:r>
     </w:p>
     <w:p>
@@ -1077,13 +1322,24 @@
           <w:b/>
           <w:bCs/>
         </w:rPr>
-        <w:t xml:space="preserve">Riset &amp; Strategi Bak Kwa Halal</w:t>
-      </w:r>
-      <w:r>
-        <w:t xml:space="preserve"> </w:t>
-      </w:r>
-      <w:r>
-        <w:t xml:space="preserve">– Menyusun riset pasar dan strategi pricing/positioning untuk produk inovatif Bak Kwa Ayam Halal.</w:t>
+        <w:t xml:space="preserve">Campaign AI TSL</w:t>
+      </w:r>
+      <w:r>
+        <w:t xml:space="preserve"> </w:t>
+      </w:r>
+      <w:r>
+        <w:t xml:space="preserve">– Mendesain alur generatif untuk kampanye brand di TSL, menghasilkan materi promosi dengan efisiensi tinggi</w:t>
+      </w:r>
+      <w:hyperlink r:id="rId32">
+        <w:r>
+          <w:rPr>
+            <w:rStyle w:val="Hyperlink"/>
+          </w:rPr>
+          <w:t xml:space="preserve">[10]</w:t>
+        </w:r>
+      </w:hyperlink>
+      <w:r>
+        <w:t xml:space="preserve">.</w:t>
       </w:r>
     </w:p>
     <w:p>
@@ -1099,13 +1355,24 @@
           <w:b/>
           <w:bCs/>
         </w:rPr>
-        <w:t xml:space="preserve">Web Portofolio AI</w:t>
-      </w:r>
-      <w:r>
-        <w:t xml:space="preserve"> </w:t>
-      </w:r>
-      <w:r>
-        <w:t xml:space="preserve">– Merancang website pribadi modern berbasis Astro dengan integrasi API AI untuk interaksi interaktif.</w:t>
+        <w:t xml:space="preserve">Web3 Research Hub &amp; AI Playbooks</w:t>
+      </w:r>
+      <w:r>
+        <w:t xml:space="preserve"> </w:t>
+      </w:r>
+      <w:r>
+        <w:t xml:space="preserve">– Meneliti UX wallet, tokenomics, smart contract, dan merancang framework evaluasi prompt untuk generative AI</w:t>
+      </w:r>
+      <w:hyperlink r:id="rId33">
+        <w:r>
+          <w:rPr>
+            <w:rStyle w:val="Hyperlink"/>
+          </w:rPr>
+          <w:t xml:space="preserve">[11]</w:t>
+        </w:r>
+      </w:hyperlink>
+      <w:r>
+        <w:t xml:space="preserve">.</w:t>
       </w:r>
     </w:p>
     <w:p>
@@ -1121,23 +1388,23 @@
           <w:b/>
           <w:bCs/>
         </w:rPr>
-        <w:t xml:space="preserve">Bak Kwa Halal, Web Portofolio AI, Entropy Inc</w:t>
-      </w:r>
-      <w:r>
-        <w:t xml:space="preserve"> </w:t>
-      </w:r>
-      <w:r>
-        <w:t xml:space="preserve">– Proyek riset dan konsep jangka panjang yang merancang ekosistem inovasi AI dan Web3 (lihat dokumen lengkap).</w:t>
-      </w:r>
-    </w:p>
-    <w:bookmarkEnd w:id="28"/>
-    <w:bookmarkStart w:id="30" w:name="keahlian"/>
+        <w:t xml:space="preserve">Project Personal Entropy Inc</w:t>
+      </w:r>
+      <w:r>
+        <w:t xml:space="preserve"> </w:t>
+      </w:r>
+      <w:r>
+        <w:t xml:space="preserve">– Konsep sistem desentralisasi pribadi untuk pengembangan AI &amp; Web3 generasi mendatang.</w:t>
+      </w:r>
+    </w:p>
+    <w:bookmarkEnd w:id="34"/>
+    <w:bookmarkStart w:id="36" w:name="keahlian-teknis-soft-skills"/>
     <w:p>
       <w:pPr>
         <w:pStyle w:val="Heading2"/>
       </w:pPr>
       <w:r>
-        <w:t xml:space="preserve">Keahlian</w:t>
+        <w:t xml:space="preserve">Keahlian Teknis &amp; Soft Skills</w:t>
       </w:r>
     </w:p>
     <w:p>
@@ -1153,13 +1420,13 @@
           <w:b/>
           <w:bCs/>
         </w:rPr>
-        <w:t xml:space="preserve">AI &amp; Prompt Engineering:</w:t>
-      </w:r>
-      <w:r>
-        <w:t xml:space="preserve"> </w:t>
-      </w:r>
-      <w:r>
-        <w:t xml:space="preserve">generative AI, LLM prompting &amp; context engineering, analisis data AI.</w:t>
+        <w:t xml:space="preserve">AI &amp; Prompt Engineering</w:t>
+      </w:r>
+      <w:r>
+        <w:t xml:space="preserve"> </w:t>
+      </w:r>
+      <w:r>
+        <w:t xml:space="preserve">– Desain LLM multi‑agent, evaluasi &amp; guardrails, generative video/image/audio (Runway, Sora, Flow, Veo, ElevenLabs), serta modul pembelajaran AI.</w:t>
       </w:r>
     </w:p>
     <w:p>
@@ -1175,13 +1442,13 @@
           <w:b/>
           <w:bCs/>
         </w:rPr>
-        <w:t xml:space="preserve">Strategi Penjualan &amp; Negosiasi:</w:t>
-      </w:r>
-      <w:r>
-        <w:t xml:space="preserve"> </w:t>
-      </w:r>
-      <w:r>
-        <w:t xml:space="preserve">value creation, customer needs analysis, hubungan pelanggan jangka panjang.</w:t>
+        <w:t xml:space="preserve">Pengembangan Web &amp; App</w:t>
+      </w:r>
+      <w:r>
+        <w:t xml:space="preserve"> </w:t>
+      </w:r>
+      <w:r>
+        <w:t xml:space="preserve">– Next.js, Astro, React, TypeScript, Node.js, tailwind CSS; API design, backend Node.js, integrasi AI agent &amp; chatbot.</w:t>
       </w:r>
     </w:p>
     <w:p>
@@ -1197,13 +1464,13 @@
           <w:b/>
           <w:bCs/>
         </w:rPr>
-        <w:t xml:space="preserve">Digital Marketing &amp; Kreatif:</w:t>
-      </w:r>
-      <w:r>
-        <w:t xml:space="preserve"> </w:t>
-      </w:r>
-      <w:r>
-        <w:t xml:space="preserve">storytelling, kampanye Gen Z, video AI, konten bilingual.</w:t>
+        <w:t xml:space="preserve">Data &amp; Riset</w:t>
+      </w:r>
+      <w:r>
+        <w:t xml:space="preserve"> </w:t>
+      </w:r>
+      <w:r>
+        <w:t xml:space="preserve">– Analisis data permintaan rideshare, riset pasar dan tren industri, tokenomics dan UX crypto.</w:t>
       </w:r>
     </w:p>
     <w:p>
@@ -1219,13 +1486,13 @@
           <w:b/>
           <w:bCs/>
         </w:rPr>
-        <w:t xml:space="preserve">Business Development &amp; Networking:</w:t>
-      </w:r>
-      <w:r>
-        <w:t xml:space="preserve"> </w:t>
-      </w:r>
-      <w:r>
-        <w:t xml:space="preserve">perencanaan bisnis, kolaborasi B2B, dan riset pasar.</w:t>
+        <w:t xml:space="preserve">Sales &amp; Business Development</w:t>
+      </w:r>
+      <w:r>
+        <w:t xml:space="preserve"> </w:t>
+      </w:r>
+      <w:r>
+        <w:t xml:space="preserve">– Value creation, negotiation, customer relationship management, pemasaran B2B dan B2C.</w:t>
       </w:r>
     </w:p>
     <w:p>
@@ -1241,13 +1508,13 @@
           <w:b/>
           <w:bCs/>
         </w:rPr>
-        <w:t xml:space="preserve">Analisis Data &amp; Tren Teknologi:</w:t>
-      </w:r>
-      <w:r>
-        <w:t xml:space="preserve"> </w:t>
-      </w:r>
-      <w:r>
-        <w:t xml:space="preserve">riset pasar transportasi, Web3, kendaraan terbang, dan teknologi masa depan.</w:t>
+        <w:t xml:space="preserve">Digital Marketing &amp; Storytelling</w:t>
+      </w:r>
+      <w:r>
+        <w:t xml:space="preserve"> </w:t>
+      </w:r>
+      <w:r>
+        <w:t xml:space="preserve">– Copywriting, visual storytelling, kampanye berbasis Gen Z, influencer marketing.</w:t>
       </w:r>
     </w:p>
     <w:p>
@@ -1263,13 +1530,465 @@
           <w:b/>
           <w:bCs/>
         </w:rPr>
-        <w:t xml:space="preserve">Bahasa:</w:t>
-      </w:r>
-      <w:r>
-        <w:t xml:space="preserve"> </w:t>
-      </w:r>
-      <w:r>
-        <w:t xml:space="preserve">Bahasa Indonesia (native), Arabic &amp; English (elementary proficiency)</w:t>
+        <w:t xml:space="preserve">Bahasa</w:t>
+      </w:r>
+      <w:r>
+        <w:t xml:space="preserve"> </w:t>
+      </w:r>
+      <w:r>
+        <w:t xml:space="preserve">– Bahasa Indonesia (native), Arab &amp; Inggris (elementary proficiency)</w:t>
+      </w:r>
+      <w:hyperlink r:id="rId35">
+        <w:r>
+          <w:rPr>
+            <w:rStyle w:val="Hyperlink"/>
+          </w:rPr>
+          <w:t xml:space="preserve">[12]</w:t>
+        </w:r>
+      </w:hyperlink>
+      <w:r>
+        <w:t xml:space="preserve">.</w:t>
+      </w:r>
+    </w:p>
+    <w:p>
+      <w:pPr>
+        <w:pStyle w:val="Compact"/>
+        <w:numPr>
+          <w:ilvl w:val="0"/>
+          <w:numId w:val="1002"/>
+        </w:numPr>
+      </w:pPr>
+      <w:r>
+        <w:rPr>
+          <w:b/>
+          <w:bCs/>
+        </w:rPr>
+        <w:t xml:space="preserve">Soft Skills</w:t>
+      </w:r>
+      <w:r>
+        <w:t xml:space="preserve"> </w:t>
+      </w:r>
+      <w:r>
+        <w:t xml:space="preserve">– Critical thinking, problem solving, leadership, mentoring, public speaking, kolaborasi transparan.</w:t>
+      </w:r>
+    </w:p>
+    <w:bookmarkEnd w:id="36"/>
+    <w:bookmarkStart w:id="37" w:name="pencapaian"/>
+    <w:p>
+      <w:pPr>
+        <w:pStyle w:val="Heading2"/>
+      </w:pPr>
+      <w:r>
+        <w:t xml:space="preserve">Pencapaian</w:t>
+      </w:r>
+    </w:p>
+    <w:p>
+      <w:pPr>
+        <w:pStyle w:val="Compact"/>
+        <w:numPr>
+          <w:ilvl w:val="0"/>
+          <w:numId w:val="1003"/>
+        </w:numPr>
+      </w:pPr>
+      <w:r>
+        <w:rPr>
+          <w:b/>
+          <w:bCs/>
+        </w:rPr>
+        <w:t xml:space="preserve">Hafalan Al‑Qur’an 30 Juz</w:t>
+      </w:r>
+      <w:r>
+        <w:t xml:space="preserve"> </w:t>
+      </w:r>
+      <w:r>
+        <w:t xml:space="preserve">– YKTN Cibulan.</w:t>
+      </w:r>
+    </w:p>
+    <w:p>
+      <w:pPr>
+        <w:pStyle w:val="Compact"/>
+        <w:numPr>
+          <w:ilvl w:val="0"/>
+          <w:numId w:val="1003"/>
+        </w:numPr>
+      </w:pPr>
+      <w:r>
+        <w:rPr>
+          <w:b/>
+          <w:bCs/>
+        </w:rPr>
+        <w:t xml:space="preserve">Pelopor Implementasi AI TSL</w:t>
+      </w:r>
+      <w:r>
+        <w:t xml:space="preserve"> </w:t>
+      </w:r>
+      <w:r>
+        <w:t xml:space="preserve">– Sebagai generative AI engineer, saya mempelopori penggunaan AI generatif di agensi marketing The Social Linked dan menciptakan sistem kerja baru.</w:t>
+      </w:r>
+    </w:p>
+    <w:bookmarkEnd w:id="37"/>
+    <w:bookmarkStart w:id="39" w:name="aktivitas-sukarela-organisasi"/>
+    <w:p>
+      <w:pPr>
+        <w:pStyle w:val="Heading2"/>
+      </w:pPr>
+      <w:r>
+        <w:t xml:space="preserve">Aktivitas Sukarela &amp; Organisasi</w:t>
+      </w:r>
+    </w:p>
+    <w:p>
+      <w:pPr>
+        <w:pStyle w:val="Compact"/>
+        <w:numPr>
+          <w:ilvl w:val="0"/>
+          <w:numId w:val="1004"/>
+        </w:numPr>
+      </w:pPr>
+      <w:r>
+        <w:rPr>
+          <w:b/>
+          <w:bCs/>
+        </w:rPr>
+        <w:t xml:space="preserve">Assistant, DEMA FDIKOM UIN Jakarta</w:t>
+      </w:r>
+      <w:r>
+        <w:t xml:space="preserve"> </w:t>
+      </w:r>
+      <w:r>
+        <w:t xml:space="preserve">– Bakti sosial (Feb 2023)</w:t>
+      </w:r>
+      <w:hyperlink r:id="rId30">
+        <w:r>
+          <w:rPr>
+            <w:rStyle w:val="Hyperlink"/>
+          </w:rPr>
+          <w:t xml:space="preserve">[9]</w:t>
+        </w:r>
+      </w:hyperlink>
+      <w:r>
+        <w:t xml:space="preserve">.</w:t>
+      </w:r>
+    </w:p>
+    <w:p>
+      <w:pPr>
+        <w:pStyle w:val="Compact"/>
+        <w:numPr>
+          <w:ilvl w:val="0"/>
+          <w:numId w:val="1004"/>
+        </w:numPr>
+      </w:pPr>
+      <w:r>
+        <w:rPr>
+          <w:b/>
+          <w:bCs/>
+        </w:rPr>
+        <w:t xml:space="preserve">Public Relations Executive, Konferensi Mahasiswa Nasional 3</w:t>
+      </w:r>
+      <w:r>
+        <w:t xml:space="preserve"> </w:t>
+      </w:r>
+      <w:r>
+        <w:t xml:space="preserve">– Feb 2023 – May 2023</w:t>
+      </w:r>
+      <w:hyperlink r:id="rId30">
+        <w:r>
+          <w:rPr>
+            <w:rStyle w:val="Hyperlink"/>
+          </w:rPr>
+          <w:t xml:space="preserve">[9]</w:t>
+        </w:r>
+      </w:hyperlink>
+      <w:r>
+        <w:t xml:space="preserve">.</w:t>
+      </w:r>
+    </w:p>
+    <w:p>
+      <w:pPr>
+        <w:pStyle w:val="Compact"/>
+        <w:numPr>
+          <w:ilvl w:val="0"/>
+          <w:numId w:val="1004"/>
+        </w:numPr>
+      </w:pPr>
+      <w:r>
+        <w:rPr>
+          <w:b/>
+          <w:bCs/>
+        </w:rPr>
+        <w:t xml:space="preserve">Teacher, Sakira 11 Prisban HK</w:t>
+      </w:r>
+      <w:r>
+        <w:t xml:space="preserve"> </w:t>
+      </w:r>
+      <w:r>
+        <w:t xml:space="preserve">– Jan 2019 – Jun 2019</w:t>
+      </w:r>
+      <w:hyperlink r:id="rId30">
+        <w:r>
+          <w:rPr>
+            <w:rStyle w:val="Hyperlink"/>
+          </w:rPr>
+          <w:t xml:space="preserve">[9]</w:t>
+        </w:r>
+      </w:hyperlink>
+      <w:r>
+        <w:t xml:space="preserve">.</w:t>
+      </w:r>
+    </w:p>
+    <w:p>
+      <w:pPr>
+        <w:pStyle w:val="Compact"/>
+        <w:numPr>
+          <w:ilvl w:val="0"/>
+          <w:numId w:val="1004"/>
+        </w:numPr>
+      </w:pPr>
+      <w:r>
+        <w:rPr>
+          <w:b/>
+          <w:bCs/>
+        </w:rPr>
+        <w:t xml:space="preserve">Assistant, Aresta 15 HK</w:t>
+      </w:r>
+      <w:r>
+        <w:t xml:space="preserve"> </w:t>
+      </w:r>
+      <w:r>
+        <w:t xml:space="preserve">– Sep 2019 – Mar 2020</w:t>
+      </w:r>
+      <w:hyperlink r:id="rId30">
+        <w:r>
+          <w:rPr>
+            <w:rStyle w:val="Hyperlink"/>
+          </w:rPr>
+          <w:t xml:space="preserve">[9]</w:t>
+        </w:r>
+      </w:hyperlink>
+      <w:r>
+        <w:t xml:space="preserve">.</w:t>
+      </w:r>
+    </w:p>
+    <w:p>
+      <w:pPr>
+        <w:pStyle w:val="Compact"/>
+        <w:numPr>
+          <w:ilvl w:val="0"/>
+          <w:numId w:val="1004"/>
+        </w:numPr>
+      </w:pPr>
+      <w:r>
+        <w:rPr>
+          <w:b/>
+          <w:bCs/>
+        </w:rPr>
+        <w:t xml:space="preserve">Staff, OSHK 24 (Language Division)</w:t>
+      </w:r>
+      <w:r>
+        <w:t xml:space="preserve"> </w:t>
+      </w:r>
+      <w:r>
+        <w:t xml:space="preserve">– Aug 2019 – Jul 2020;</w:t>
+      </w:r>
+      <w:r>
+        <w:t xml:space="preserve"> </w:t>
+      </w:r>
+      <w:r>
+        <w:rPr>
+          <w:b/>
+          <w:bCs/>
+        </w:rPr>
+        <w:t xml:space="preserve">Staff, Muharrik Lugoh</w:t>
+      </w:r>
+      <w:r>
+        <w:t xml:space="preserve"> </w:t>
+      </w:r>
+      <w:r>
+        <w:t xml:space="preserve">– Sep 2018 – Apr 2019</w:t>
+      </w:r>
+      <w:hyperlink r:id="rId38">
+        <w:r>
+          <w:rPr>
+            <w:rStyle w:val="Hyperlink"/>
+          </w:rPr>
+          <w:t xml:space="preserve">[13]</w:t>
+        </w:r>
+      </w:hyperlink>
+      <w:r>
+        <w:t xml:space="preserve">.</w:t>
+      </w:r>
+    </w:p>
+    <w:bookmarkEnd w:id="39"/>
+    <w:bookmarkStart w:id="40" w:name="referensi"/>
+    <w:p>
+      <w:pPr>
+        <w:pStyle w:val="Heading2"/>
+      </w:pPr>
+      <w:r>
+        <w:t xml:space="preserve">Referensi</w:t>
+      </w:r>
+    </w:p>
+    <w:p>
+      <w:pPr>
+        <w:pStyle w:val="FirstParagraph"/>
+      </w:pPr>
+      <w:r>
+        <w:t xml:space="preserve">Tersedia atas permintaan.</w:t>
+      </w:r>
+    </w:p>
+    <w:bookmarkEnd w:id="40"/>
+    <w:bookmarkEnd w:id="41"/>
+    <w:bookmarkEnd w:id="42"/>
+    <w:p>
+      <w:r>
+        <w:pict>
+          <v:rect style="width:0;height:1.5pt" o:hralign="center" o:hrstd="t" o:hr="t"/>
+        </w:pict>
+      </w:r>
+    </w:p>
+    <w:bookmarkStart w:id="43" w:name="citations"/>
+    <w:p>
+      <w:pPr>
+        <w:pStyle w:val="FirstParagraph"/>
+      </w:pPr>
+      <w:hyperlink r:id="rId21">
+        <w:r>
+          <w:rPr>
+            <w:rStyle w:val="Hyperlink"/>
+          </w:rPr>
+          <w:t xml:space="preserve">[1]</w:t>
+        </w:r>
+      </w:hyperlink>
+      <w:r>
+        <w:t xml:space="preserve"> </w:t>
+      </w:r>
+      <w:r>
+        <w:t xml:space="preserve">(6) Rifqy Hazim H R | LinkedIn</w:t>
+      </w:r>
+    </w:p>
+    <w:p>
+      <w:pPr>
+        <w:pStyle w:val="BodyText"/>
+      </w:pPr>
+      <w:hyperlink r:id="rId21">
+        <w:r>
+          <w:rPr>
+            <w:rStyle w:val="Hyperlink"/>
+          </w:rPr>
+          <w:t xml:space="preserve">https://www.linkedin.com/in/rifqy-hazim-h-r-88963128a/</w:t>
+        </w:r>
+      </w:hyperlink>
+    </w:p>
+    <w:p>
+      <w:pPr>
+        <w:pStyle w:val="BodyText"/>
+      </w:pPr>
+      <w:hyperlink r:id="rId24">
+        <w:r>
+          <w:rPr>
+            <w:rStyle w:val="Hyperlink"/>
+          </w:rPr>
+          <w:t xml:space="preserve">[2]</w:t>
+        </w:r>
+      </w:hyperlink>
+      <w:r>
+        <w:t xml:space="preserve"> </w:t>
+      </w:r>
+      <w:hyperlink r:id="rId24">
+        <w:r>
+          <w:rPr>
+            <w:rStyle w:val="Hyperlink"/>
+          </w:rPr>
+          <w:t xml:space="preserve">[6]</w:t>
+        </w:r>
+      </w:hyperlink>
+      <w:r>
+        <w:t xml:space="preserve"> </w:t>
+      </w:r>
+      <w:r>
+        <w:t xml:space="preserve">Rifqy Hazim HR — Home</w:t>
+      </w:r>
+    </w:p>
+    <w:p>
+      <w:pPr>
+        <w:pStyle w:val="BodyText"/>
+      </w:pPr>
+      <w:hyperlink r:id="rId24">
+        <w:r>
+          <w:rPr>
+            <w:rStyle w:val="Hyperlink"/>
+          </w:rPr>
+          <w:t xml:space="preserve">https://rifqy-portofolio.vercel.app/about</w:t>
+        </w:r>
+      </w:hyperlink>
+    </w:p>
+    <w:p>
+      <w:pPr>
+        <w:pStyle w:val="BodyText"/>
+      </w:pPr>
+      <w:hyperlink r:id="rId27">
+        <w:r>
+          <w:rPr>
+            <w:rStyle w:val="Hyperlink"/>
+          </w:rPr>
+          <w:t xml:space="preserve">[3]</w:t>
+        </w:r>
+      </w:hyperlink>
+      <w:r>
+        <w:t xml:space="preserve"> </w:t>
+      </w:r>
+      <w:hyperlink r:id="rId27">
+        <w:r>
+          <w:rPr>
+            <w:rStyle w:val="Hyperlink"/>
+          </w:rPr>
+          <w:t xml:space="preserve">[4]</w:t>
+        </w:r>
+      </w:hyperlink>
+      <w:r>
+        <w:t xml:space="preserve"> </w:t>
+      </w:r>
+      <w:r>
+        <w:t xml:space="preserve">(6) Education | Rifqy Hazim H R | LinkedIn</w:t>
+      </w:r>
+    </w:p>
+    <w:p>
+      <w:pPr>
+        <w:pStyle w:val="BodyText"/>
+      </w:pPr>
+      <w:hyperlink r:id="rId27">
+        <w:r>
+          <w:rPr>
+            <w:rStyle w:val="Hyperlink"/>
+          </w:rPr>
+          <w:t xml:space="preserve">https://www.linkedin.com/in/rifqy-hazim-h-r-88963128a/details/education/</w:t>
+        </w:r>
+      </w:hyperlink>
+    </w:p>
+    <w:p>
+      <w:pPr>
+        <w:pStyle w:val="BodyText"/>
+      </w:pPr>
+      <w:hyperlink r:id="rId29">
+        <w:r>
+          <w:rPr>
+            <w:rStyle w:val="Hyperlink"/>
+          </w:rPr>
+          <w:t xml:space="preserve">[5]</w:t>
+        </w:r>
+      </w:hyperlink>
+      <w:r>
+        <w:t xml:space="preserve"> </w:t>
+      </w:r>
+      <w:hyperlink r:id="rId29">
+        <w:r>
+          <w:rPr>
+            <w:rStyle w:val="Hyperlink"/>
+          </w:rPr>
+          <w:t xml:space="preserve">[7]</w:t>
+        </w:r>
+      </w:hyperlink>
+      <w:r>
+        <w:t xml:space="preserve"> </w:t>
       </w:r>
       <w:hyperlink r:id="rId29">
         <w:r>
@@ -1280,95 +1999,30 @@
         </w:r>
       </w:hyperlink>
       <w:r>
-        <w:t xml:space="preserve">.</w:t>
-      </w:r>
-    </w:p>
-    <w:bookmarkEnd w:id="30"/>
-    <w:bookmarkStart w:id="31" w:name="sertifikasi-penghargaan"/>
-    <w:p>
-      <w:pPr>
-        <w:pStyle w:val="Heading2"/>
-      </w:pPr>
-      <w:r>
-        <w:t xml:space="preserve">Sertifikasi &amp; Penghargaan</w:t>
-      </w:r>
-    </w:p>
-    <w:p>
-      <w:pPr>
-        <w:pStyle w:val="Compact"/>
-        <w:numPr>
-          <w:ilvl w:val="0"/>
-          <w:numId w:val="1003"/>
-        </w:numPr>
-      </w:pPr>
-      <w:r>
-        <w:rPr>
-          <w:b/>
-          <w:bCs/>
-        </w:rPr>
-        <w:t xml:space="preserve">Hafalan Al‑Qur’an 30 Juz</w:t>
-      </w:r>
-      <w:r>
-        <w:t xml:space="preserve"> </w:t>
-      </w:r>
-      <w:r>
-        <w:t xml:space="preserve">– YKTN Cibulan.</w:t>
-      </w:r>
-    </w:p>
-    <w:p>
-      <w:pPr>
-        <w:pStyle w:val="Compact"/>
-        <w:numPr>
-          <w:ilvl w:val="0"/>
-          <w:numId w:val="1003"/>
-        </w:numPr>
-      </w:pPr>
-      <w:r>
-        <w:rPr>
-          <w:b/>
-          <w:bCs/>
-        </w:rPr>
-        <w:t xml:space="preserve">Sertifikasi Internal AI Creative Workflow</w:t>
-      </w:r>
-      <w:r>
-        <w:t xml:space="preserve"> </w:t>
-      </w:r>
-      <w:r>
-        <w:t xml:space="preserve">– The Social Linked (2025).</w:t>
-      </w:r>
-    </w:p>
-    <w:bookmarkEnd w:id="31"/>
-    <w:bookmarkStart w:id="34" w:name="aktivitas-sukarela-organisasi"/>
-    <w:p>
-      <w:pPr>
-        <w:pStyle w:val="Heading2"/>
-      </w:pPr>
-      <w:r>
-        <w:t xml:space="preserve">Aktivitas Sukarela &amp; Organisasi</w:t>
-      </w:r>
-    </w:p>
-    <w:p>
-      <w:pPr>
-        <w:pStyle w:val="Compact"/>
-        <w:numPr>
-          <w:ilvl w:val="0"/>
-          <w:numId w:val="1004"/>
-        </w:numPr>
-      </w:pPr>
-      <w:r>
-        <w:rPr>
-          <w:b/>
-          <w:bCs/>
-        </w:rPr>
-        <w:t xml:space="preserve">Assistant, DEMA FDIKOM UIN Jakarta</w:t>
-      </w:r>
-      <w:r>
-        <w:t xml:space="preserve"> </w:t>
-      </w:r>
-      <w:r>
-        <w:t xml:space="preserve">– Bakti sosial (Feb 2023)</w:t>
-      </w:r>
-      <w:hyperlink r:id="rId32">
+        <w:t xml:space="preserve"> </w:t>
+      </w:r>
+      <w:r>
+        <w:t xml:space="preserve">(6) Experience | Rifqy Hazim H R | LinkedIn</w:t>
+      </w:r>
+    </w:p>
+    <w:p>
+      <w:pPr>
+        <w:pStyle w:val="BodyText"/>
+      </w:pPr>
+      <w:hyperlink r:id="rId29">
+        <w:r>
+          <w:rPr>
+            <w:rStyle w:val="Hyperlink"/>
+          </w:rPr>
+          <w:t xml:space="preserve">https://www.linkedin.com/in/rifqy-hazim-h-r-88963128a/details/experience/</w:t>
+        </w:r>
+      </w:hyperlink>
+    </w:p>
+    <w:p>
+      <w:pPr>
+        <w:pStyle w:val="BodyText"/>
+      </w:pPr>
+      <w:hyperlink r:id="rId30">
         <w:r>
           <w:rPr>
             <w:rStyle w:val="Hyperlink"/>
@@ -1377,146 +2031,30 @@
         </w:r>
       </w:hyperlink>
       <w:r>
-        <w:t xml:space="preserve">.</w:t>
-      </w:r>
-    </w:p>
-    <w:p>
-      <w:pPr>
-        <w:pStyle w:val="Compact"/>
-        <w:numPr>
-          <w:ilvl w:val="0"/>
-          <w:numId w:val="1004"/>
-        </w:numPr>
-      </w:pPr>
-      <w:r>
-        <w:rPr>
-          <w:b/>
-          <w:bCs/>
-        </w:rPr>
-        <w:t xml:space="preserve">Public Relations Executive, Konferensi Mahasiswa Nasional 3</w:t>
-      </w:r>
-      <w:r>
-        <w:t xml:space="preserve"> </w:t>
-      </w:r>
-      <w:r>
-        <w:t xml:space="preserve">– Feb 2023 – May 2023</w:t>
-      </w:r>
-      <w:hyperlink r:id="rId32">
+        <w:t xml:space="preserve"> </w:t>
+      </w:r>
+      <w:r>
+        <w:t xml:space="preserve">(6) Volunteering | Rifqy Hazim H R | LinkedIn</w:t>
+      </w:r>
+    </w:p>
+    <w:p>
+      <w:pPr>
+        <w:pStyle w:val="BodyText"/>
+      </w:pPr>
+      <w:hyperlink r:id="rId30">
         <w:r>
           <w:rPr>
             <w:rStyle w:val="Hyperlink"/>
           </w:rPr>
-          <w:t xml:space="preserve">[9]</w:t>
+          <w:t xml:space="preserve">https://www.linkedin.com/in/rifqy-hazim-h-r-88963128a/details/volunteering-experiences/</w:t>
         </w:r>
       </w:hyperlink>
-      <w:r>
-        <w:t xml:space="preserve">.</w:t>
-      </w:r>
-    </w:p>
-    <w:p>
-      <w:pPr>
-        <w:pStyle w:val="Compact"/>
-        <w:numPr>
-          <w:ilvl w:val="0"/>
-          <w:numId w:val="1004"/>
-        </w:numPr>
-      </w:pPr>
-      <w:r>
-        <w:rPr>
-          <w:b/>
-          <w:bCs/>
-        </w:rPr>
-        <w:t xml:space="preserve">Teacher, Sakira 11 Prisban HK</w:t>
-      </w:r>
-      <w:r>
-        <w:t xml:space="preserve"> </w:t>
-      </w:r>
-      <w:r>
-        <w:t xml:space="preserve">– Jan 2019 – Jun 2019</w:t>
-      </w:r>
+    </w:p>
+    <w:p>
+      <w:pPr>
+        <w:pStyle w:val="BodyText"/>
+      </w:pPr>
       <w:hyperlink r:id="rId32">
-        <w:r>
-          <w:rPr>
-            <w:rStyle w:val="Hyperlink"/>
-          </w:rPr>
-          <w:t xml:space="preserve">[9]</w:t>
-        </w:r>
-      </w:hyperlink>
-      <w:r>
-        <w:t xml:space="preserve">.</w:t>
-      </w:r>
-    </w:p>
-    <w:p>
-      <w:pPr>
-        <w:pStyle w:val="Compact"/>
-        <w:numPr>
-          <w:ilvl w:val="0"/>
-          <w:numId w:val="1004"/>
-        </w:numPr>
-      </w:pPr>
-      <w:r>
-        <w:rPr>
-          <w:b/>
-          <w:bCs/>
-        </w:rPr>
-        <w:t xml:space="preserve">Assistant, Aresta 15 HK</w:t>
-      </w:r>
-      <w:r>
-        <w:t xml:space="preserve"> </w:t>
-      </w:r>
-      <w:r>
-        <w:t xml:space="preserve">– Sep 2019 – Mar 2020</w:t>
-      </w:r>
-      <w:hyperlink r:id="rId32">
-        <w:r>
-          <w:rPr>
-            <w:rStyle w:val="Hyperlink"/>
-          </w:rPr>
-          <w:t xml:space="preserve">[9]</w:t>
-        </w:r>
-      </w:hyperlink>
-      <w:r>
-        <w:t xml:space="preserve">.</w:t>
-      </w:r>
-    </w:p>
-    <w:p>
-      <w:pPr>
-        <w:pStyle w:val="Compact"/>
-        <w:numPr>
-          <w:ilvl w:val="0"/>
-          <w:numId w:val="1004"/>
-        </w:numPr>
-      </w:pPr>
-      <w:r>
-        <w:rPr>
-          <w:b/>
-          <w:bCs/>
-        </w:rPr>
-        <w:t xml:space="preserve">Staff, OSHK 24 (Language Division)</w:t>
-      </w:r>
-      <w:r>
-        <w:t xml:space="preserve"> </w:t>
-      </w:r>
-      <w:r>
-        <w:t xml:space="preserve">– Aug 2019 – Jul 2020;</w:t>
-      </w:r>
-      <w:r>
-        <w:t xml:space="preserve"> </w:t>
-      </w:r>
-      <w:r>
-        <w:rPr>
-          <w:b/>
-          <w:bCs/>
-        </w:rPr>
-        <w:t xml:space="preserve">Staff, Muharrik Lugoh</w:t>
-      </w:r>
-      <w:r>
-        <w:t xml:space="preserve"> </w:t>
-      </w:r>
-      <w:r>
-        <w:t xml:space="preserve">– Sep 2018 – Apr 2019</w:t>
-      </w:r>
-      <w:hyperlink r:id="rId33">
         <w:r>
           <w:rPr>
             <w:rStyle w:val="Hyperlink"/>
@@ -1525,112 +2063,54 @@
         </w:r>
       </w:hyperlink>
       <w:r>
-        <w:t xml:space="preserve">.</w:t>
-      </w:r>
-    </w:p>
-    <w:bookmarkEnd w:id="34"/>
-    <w:bookmarkStart w:id="35" w:name="visi-karier"/>
-    <w:p>
-      <w:pPr>
-        <w:pStyle w:val="Heading2"/>
-      </w:pPr>
-      <w:r>
-        <w:t xml:space="preserve">Visi Karier</w:t>
-      </w:r>
-    </w:p>
-    <w:p>
-      <w:pPr>
-        <w:pStyle w:val="FirstParagraph"/>
-      </w:pPr>
-      <w:r>
-        <w:t xml:space="preserve">Saya berambisi menjadi</w:t>
-      </w:r>
-      <w:r>
-        <w:t xml:space="preserve"> </w:t>
-      </w:r>
-      <w:r>
-        <w:rPr>
-          <w:b/>
-          <w:bCs/>
-        </w:rPr>
-        <w:t xml:space="preserve">AI &amp; Teknologi Strategist</w:t>
-      </w:r>
-      <w:r>
-        <w:t xml:space="preserve"> </w:t>
-      </w:r>
-      <w:r>
-        <w:t xml:space="preserve">yang mampu menjembatani dunia AI, web, dan marketing. Fokus saya adalah membangun sistem otomasi dan inovasi berbasis AI, memperkuat posisi di industri otomotif dan properti, serta berinvestasi pada teknologi masa depan seperti Web3 dan kendaraan terbang.</w:t>
-      </w:r>
-    </w:p>
-    <w:bookmarkEnd w:id="35"/>
-    <w:bookmarkStart w:id="36" w:name="referensi"/>
-    <w:p>
-      <w:pPr>
-        <w:pStyle w:val="Heading2"/>
-      </w:pPr>
-      <w:r>
-        <w:t xml:space="preserve">Referensi</w:t>
-      </w:r>
-    </w:p>
-    <w:p>
-      <w:pPr>
-        <w:pStyle w:val="FirstParagraph"/>
-      </w:pPr>
-      <w:r>
-        <w:t xml:space="preserve">Referensi tersedia atas permintaan.</w:t>
-      </w:r>
-    </w:p>
-    <w:bookmarkEnd w:id="36"/>
-    <w:bookmarkEnd w:id="37"/>
-    <w:bookmarkEnd w:id="38"/>
-    <w:p>
-      <w:r>
-        <w:pict>
-          <v:rect style="width:0;height:1.5pt" o:hralign="center" o:hrstd="t" o:hr="t"/>
-        </w:pict>
-      </w:r>
-    </w:p>
-    <w:bookmarkStart w:id="39" w:name="citations"/>
-    <w:p>
-      <w:pPr>
-        <w:pStyle w:val="FirstParagraph"/>
-      </w:pPr>
-      <w:hyperlink r:id="rId21">
+        <w:t xml:space="preserve"> </w:t>
+      </w:r>
+      <w:r>
+        <w:t xml:space="preserve">Rifqy Hazim HR — Home</w:t>
+      </w:r>
+    </w:p>
+    <w:p>
+      <w:pPr>
+        <w:pStyle w:val="BodyText"/>
+      </w:pPr>
+      <w:hyperlink r:id="rId32">
         <w:r>
           <w:rPr>
             <w:rStyle w:val="Hyperlink"/>
           </w:rPr>
-          <w:t xml:space="preserve">[1]</w:t>
+          <w:t xml:space="preserve">https://rifqy-portofolio.vercel.app/works</w:t>
         </w:r>
       </w:hyperlink>
-      <w:r>
-        <w:t xml:space="preserve"> </w:t>
-      </w:r>
-      <w:hyperlink r:id="rId21">
+    </w:p>
+    <w:p>
+      <w:pPr>
+        <w:pStyle w:val="BodyText"/>
+      </w:pPr>
+      <w:hyperlink r:id="rId33">
         <w:r>
           <w:rPr>
             <w:rStyle w:val="Hyperlink"/>
           </w:rPr>
-          <w:t xml:space="preserve">[2]</w:t>
+          <w:t xml:space="preserve">[11]</w:t>
         </w:r>
       </w:hyperlink>
       <w:r>
         <w:t xml:space="preserve"> </w:t>
       </w:r>
       <w:r>
-        <w:t xml:space="preserve">(6) Rifqy Hazim H R | LinkedIn</w:t>
+        <w:t xml:space="preserve">Rifqy Hazim HR — Home</w:t>
       </w:r>
     </w:p>
     <w:p>
       <w:pPr>
         <w:pStyle w:val="BodyText"/>
       </w:pPr>
-      <w:hyperlink r:id="rId21">
+      <w:hyperlink r:id="rId33">
         <w:r>
           <w:rPr>
             <w:rStyle w:val="Hyperlink"/>
           </w:rPr>
-          <w:t xml:space="preserve">https://www.linkedin.com/in/rifqy-hazim-h-r-88963128a/</w:t>
+          <w:t xml:space="preserve">https://rifqy-portofolio.vercel.app/</w:t>
         </w:r>
       </w:hyperlink>
     </w:p>
@@ -1638,123 +2118,26 @@
       <w:pPr>
         <w:pStyle w:val="BodyText"/>
       </w:pPr>
-      <w:hyperlink r:id="rId24">
+      <w:hyperlink r:id="rId35">
         <w:r>
           <w:rPr>
             <w:rStyle w:val="Hyperlink"/>
           </w:rPr>
-          <w:t xml:space="preserve">[3]</w:t>
+          <w:t xml:space="preserve">[12]</w:t>
         </w:r>
       </w:hyperlink>
       <w:r>
         <w:t xml:space="preserve"> </w:t>
       </w:r>
-      <w:hyperlink r:id="rId24">
-        <w:r>
-          <w:rPr>
-            <w:rStyle w:val="Hyperlink"/>
-          </w:rPr>
-          <w:t xml:space="preserve">[4]</w:t>
-        </w:r>
-      </w:hyperlink>
-      <w:r>
-        <w:t xml:space="preserve"> </w:t>
-      </w:r>
-      <w:r>
-        <w:t xml:space="preserve">(6) Education | Rifqy Hazim H R | LinkedIn</w:t>
+      <w:r>
+        <w:t xml:space="preserve">(6) Languages | Rifqy Hazim H R | LinkedIn</w:t>
       </w:r>
     </w:p>
     <w:p>
       <w:pPr>
         <w:pStyle w:val="BodyText"/>
       </w:pPr>
-      <w:hyperlink r:id="rId24">
-        <w:r>
-          <w:rPr>
-            <w:rStyle w:val="Hyperlink"/>
-          </w:rPr>
-          <w:t xml:space="preserve">https://www.linkedin.com/in/rifqy-hazim-h-r-88963128a/details/education/</w:t>
-        </w:r>
-      </w:hyperlink>
-    </w:p>
-    <w:p>
-      <w:pPr>
-        <w:pStyle w:val="BodyText"/>
-      </w:pPr>
-      <w:hyperlink r:id="rId26">
-        <w:r>
-          <w:rPr>
-            <w:rStyle w:val="Hyperlink"/>
-          </w:rPr>
-          <w:t xml:space="preserve">[5]</w:t>
-        </w:r>
-      </w:hyperlink>
-      <w:r>
-        <w:t xml:space="preserve"> </w:t>
-      </w:r>
-      <w:hyperlink r:id="rId26">
-        <w:r>
-          <w:rPr>
-            <w:rStyle w:val="Hyperlink"/>
-          </w:rPr>
-          <w:t xml:space="preserve">[6]</w:t>
-        </w:r>
-      </w:hyperlink>
-      <w:r>
-        <w:t xml:space="preserve"> </w:t>
-      </w:r>
-      <w:hyperlink r:id="rId26">
-        <w:r>
-          <w:rPr>
-            <w:rStyle w:val="Hyperlink"/>
-          </w:rPr>
-          <w:t xml:space="preserve">[7]</w:t>
-        </w:r>
-      </w:hyperlink>
-      <w:r>
-        <w:t xml:space="preserve"> </w:t>
-      </w:r>
-      <w:r>
-        <w:t xml:space="preserve">(6) Experience | Rifqy Hazim H R | LinkedIn</w:t>
-      </w:r>
-    </w:p>
-    <w:p>
-      <w:pPr>
-        <w:pStyle w:val="BodyText"/>
-      </w:pPr>
-      <w:hyperlink r:id="rId26">
-        <w:r>
-          <w:rPr>
-            <w:rStyle w:val="Hyperlink"/>
-          </w:rPr>
-          <w:t xml:space="preserve">https://www.linkedin.com/in/rifqy-hazim-h-r-88963128a/details/experience/</w:t>
-        </w:r>
-      </w:hyperlink>
-    </w:p>
-    <w:p>
-      <w:pPr>
-        <w:pStyle w:val="BodyText"/>
-      </w:pPr>
-      <w:hyperlink r:id="rId29">
-        <w:r>
-          <w:rPr>
-            <w:rStyle w:val="Hyperlink"/>
-          </w:rPr>
-          <w:t xml:space="preserve">[8]</w:t>
-        </w:r>
-      </w:hyperlink>
-      <w:r>
-        <w:t xml:space="preserve"> </w:t>
-      </w:r>
-      <w:r>
-        <w:t xml:space="preserve">(6) Languages | Rifqy Hazim H R | LinkedIn</w:t>
-      </w:r>
-    </w:p>
-    <w:p>
-      <w:pPr>
-        <w:pStyle w:val="BodyText"/>
-      </w:pPr>
-      <w:hyperlink r:id="rId29">
+      <w:hyperlink r:id="rId35">
         <w:r>
           <w:rPr>
             <w:rStyle w:val="Hyperlink"/>
@@ -1767,58 +2150,26 @@
       <w:pPr>
         <w:pStyle w:val="BodyText"/>
       </w:pPr>
-      <w:hyperlink r:id="rId32">
+      <w:hyperlink r:id="rId38">
         <w:r>
           <w:rPr>
             <w:rStyle w:val="Hyperlink"/>
           </w:rPr>
-          <w:t xml:space="preserve">[9]</w:t>
+          <w:t xml:space="preserve">[13]</w:t>
         </w:r>
       </w:hyperlink>
       <w:r>
         <w:t xml:space="preserve"> </w:t>
       </w:r>
       <w:r>
-        <w:t xml:space="preserve">(6) Volunteering | Rifqy Hazim H R | LinkedIn</w:t>
+        <w:t xml:space="preserve">(6) Rifqy Hazim H R | LinkedIn</w:t>
       </w:r>
     </w:p>
     <w:p>
       <w:pPr>
         <w:pStyle w:val="BodyText"/>
       </w:pPr>
-      <w:hyperlink r:id="rId32">
-        <w:r>
-          <w:rPr>
-            <w:rStyle w:val="Hyperlink"/>
-          </w:rPr>
-          <w:t xml:space="preserve">https://www.linkedin.com/in/rifqy-hazim-h-r-88963128a/details/volunteering-experiences/</w:t>
-        </w:r>
-      </w:hyperlink>
-    </w:p>
-    <w:p>
-      <w:pPr>
-        <w:pStyle w:val="BodyText"/>
-      </w:pPr>
-      <w:hyperlink r:id="rId33">
-        <w:r>
-          <w:rPr>
-            <w:rStyle w:val="Hyperlink"/>
-          </w:rPr>
-          <w:t xml:space="preserve">[10]</w:t>
-        </w:r>
-      </w:hyperlink>
-      <w:r>
-        <w:t xml:space="preserve"> </w:t>
-      </w:r>
-      <w:r>
-        <w:t xml:space="preserve">(6) Rifqy Hazim H R | LinkedIn</w:t>
-      </w:r>
-    </w:p>
-    <w:p>
-      <w:pPr>
-        <w:pStyle w:val="BodyText"/>
-      </w:pPr>
-      <w:hyperlink r:id="rId33">
+      <w:hyperlink r:id="rId38">
         <w:r>
           <w:rPr>
             <w:rStyle w:val="Hyperlink"/>
@@ -1827,7 +2178,7 @@
         </w:r>
       </w:hyperlink>
     </w:p>
-    <w:bookmarkEnd w:id="39"/>
+    <w:bookmarkEnd w:id="43"/>
     <w:sectPr>
       <w:footnotePr>
         <w:numRestart w:val="eachSect"/>

</xml_diff>

<commit_message>
Refocus portfolio messaging on prompt and agent work
</commit_message>
<xml_diff>
--- a/public/cv-dan-portofolio/CV Rifqy by agent mode.docx
+++ b/public/cv-dan-portofolio/CV Rifqy by agent mode.docx
@@ -283,13 +283,49 @@
           <w:b/>
           <w:bCs/>
         </w:rPr>
-        <w:t xml:space="preserve">Generative AI Engineer, Prompt/Context Engineer &amp; AI Agent Developer</w:t>
-      </w:r>
-      <w:r>
-        <w:t xml:space="preserve"> </w:t>
-      </w:r>
-      <w:r>
-        <w:t xml:space="preserve">dengan pengalaman mendalam dalam desain agen LLM, pipeline generatif, pengembangan aplikasi web dan mobile, serta eksplorasi robotika dan Web3. Terampil merancang agen LLM multi‑step dengan memori dan evaluasi, mengembangkan video &amp; gambar AI realistis (Sora, Runway, Flow, Veo), serta membangun website modern (Next.js, Astro, TypeScript). Berorientasi pada kualitas tinggi, dokumentasi rapi, dan kolaborasi transparan. Berkomitmen membangun ekosistem inovasi yang menggabungkan AI, robotika, Web3, dan pengembangan bisnis</w:t>
+        <w:t xml:space="preserve">Prompt &amp; Context Engineer untuk LLMs dan alat Generative AI</w:t>
+      </w:r>
+      <w:r>
+        <w:t xml:space="preserve">,</w:t>
+      </w:r>
+      <w:r>
+        <w:t xml:space="preserve"> </w:t>
+      </w:r>
+      <w:r>
+        <w:rPr>
+          <w:b/>
+          <w:bCs/>
+        </w:rPr>
+        <w:t xml:space="preserve">Web &amp; App Developer</w:t>
+      </w:r>
+      <w:r>
+        <w:t xml:space="preserve">,</w:t>
+      </w:r>
+      <w:r>
+        <w:t xml:space="preserve"> </w:t>
+      </w:r>
+      <w:r>
+        <w:rPr>
+          <w:b/>
+          <w:bCs/>
+        </w:rPr>
+        <w:t xml:space="preserve">AI Agent Developer</w:t>
+      </w:r>
+      <w:r>
+        <w:t xml:space="preserve">, serta</w:t>
+      </w:r>
+      <w:r>
+        <w:t xml:space="preserve"> </w:t>
+      </w:r>
+      <w:r>
+        <w:rPr>
+          <w:b/>
+          <w:bCs/>
+        </w:rPr>
+        <w:t xml:space="preserve">Web3 enthusiast</w:t>
+      </w:r>
+      <w:r>
+        <w:t xml:space="preserve">. Berpengalaman dalam desain agen LLM multi‑step dengan memori dan evaluasi, perancangan pipeline generatif (video, gambar, audio), dan pembangunan aplikasi web/mobile modern. Terampil merancang konten AI yang realistis (Sora, Runway, Flow, Veo), serta mengintegrasikan AI ke dalam sistem dan workflow. Berorientasi pada kualitas tinggi, dokumentasi rapi, dan kolaborasi transparan. Berkomitmen membangun ekosistem inovasi yang menggabungkan AI, Web3, dan pengembangan bisnis</w:t>
       </w:r>
       <w:hyperlink r:id="rId24">
         <w:r>
@@ -318,23 +354,65 @@
         <w:pStyle w:val="FirstParagraph"/>
       </w:pPr>
       <w:r>
-        <w:t xml:space="preserve">Menjadi</w:t>
-      </w:r>
-      <w:r>
-        <w:t xml:space="preserve"> </w:t>
-      </w:r>
-      <w:r>
-        <w:rPr>
-          <w:b/>
-          <w:bCs/>
-        </w:rPr>
-        <w:t xml:space="preserve">Generative AI Engineer &amp; AI Agent Developer</w:t>
-      </w:r>
-      <w:r>
-        <w:t xml:space="preserve"> </w:t>
-      </w:r>
-      <w:r>
-        <w:t xml:space="preserve">yang memimpin inovasi di bidang AI, generative media, dan robotika. Fokus saya adalah merancang agen LLM yang adaptif, pipeline generatif yang efisien, serta membangun aplikasi web dan mobile yang mengintegrasikan AI secara mendalam. Saya juga berupaya memperkuat ekosistem Web3, tokenomics, dan crypto untuk mendukung ekonomi digital masa depan.</w:t>
+        <w:t xml:space="preserve">Menjadi profesional yang unggul dalam</w:t>
+      </w:r>
+      <w:r>
+        <w:t xml:space="preserve"> </w:t>
+      </w:r>
+      <w:r>
+        <w:rPr>
+          <w:b/>
+          <w:bCs/>
+        </w:rPr>
+        <w:t xml:space="preserve">Prompt &amp; Context Engineering</w:t>
+      </w:r>
+      <w:r>
+        <w:t xml:space="preserve"> </w:t>
+      </w:r>
+      <w:r>
+        <w:t xml:space="preserve">untuk LLMs dan alat Generative AI,</w:t>
+      </w:r>
+      <w:r>
+        <w:t xml:space="preserve"> </w:t>
+      </w:r>
+      <w:r>
+        <w:rPr>
+          <w:b/>
+          <w:bCs/>
+        </w:rPr>
+        <w:t xml:space="preserve">AI Agent Development</w:t>
+      </w:r>
+      <w:r>
+        <w:t xml:space="preserve">, dan</w:t>
+      </w:r>
+      <w:r>
+        <w:t xml:space="preserve"> </w:t>
+      </w:r>
+      <w:r>
+        <w:rPr>
+          <w:b/>
+          <w:bCs/>
+        </w:rPr>
+        <w:t xml:space="preserve">pengembangan web &amp; aplikasi</w:t>
+      </w:r>
+      <w:r>
+        <w:t xml:space="preserve">. Saya berfokus merancang agen LLM adaptif, pipeline generatif efisien, serta aplikasi yang mengintegrasikan AI secara mendalam. Selain itu, saya ingin memperluas wawasan di bidang</w:t>
+      </w:r>
+      <w:r>
+        <w:t xml:space="preserve"> </w:t>
+      </w:r>
+      <w:r>
+        <w:rPr>
+          <w:b/>
+          <w:bCs/>
+        </w:rPr>
+        <w:t xml:space="preserve">Web3</w:t>
+      </w:r>
+      <w:r>
+        <w:t xml:space="preserve"> </w:t>
+      </w:r>
+      <w:r>
+        <w:t xml:space="preserve">dan tokenomics untuk mendukung ekonomi digital masa depan.</w:t>
       </w:r>
     </w:p>
     <w:bookmarkEnd w:id="26"/>
@@ -621,7 +699,7 @@
                 <w:b/>
                 <w:bCs/>
               </w:rPr>
-              <w:t xml:space="preserve">Generative AI Engineer &amp; Prompt/Context Engineer</w:t>
+              <w:t xml:space="preserve">Prompt &amp; Context Engineer (LLM &amp; Generative AI Tools)</w:t>
             </w:r>
           </w:p>
         </w:tc>

</xml_diff>